<commit_message>
Ajuste de la extensión del informe preliminar
Co-Authored-By: gpasiche <107153618+gpasiche@users.noreply.github.com>
</commit_message>
<xml_diff>
--- a/TP1/TP1 Programacion.docx
+++ b/TP1/TP1 Programacion.docx
@@ -451,35 +451,7 @@
             <w:u w:val="none"/>
             <w:lang w:val="es-ES_tradnl"/>
           </w:rPr>
-          <w:t>https://github.com/lucianoaltamirano435-rgb/Grupo_3_Trab</w:t>
-        </w:r>
-        <w:r>
-          <w:rPr>
-            <w:rStyle w:val="Hipervnculo"/>
-            <w:rFonts w:cs="Times New Roman"/>
-            <w:bCs/>
-            <w:smallCaps/>
-            <w:spacing w:val="5"/>
-            <w:sz w:val="22"/>
-            <w:szCs w:val="32"/>
-            <w:u w:val="none"/>
-            <w:lang w:val="es-ES_tradnl"/>
-          </w:rPr>
-          <w:t>a</w:t>
-        </w:r>
-        <w:r>
-          <w:rPr>
-            <w:rStyle w:val="Hipervnculo"/>
-            <w:rFonts w:cs="Times New Roman"/>
-            <w:bCs/>
-            <w:smallCaps/>
-            <w:spacing w:val="5"/>
-            <w:sz w:val="22"/>
-            <w:szCs w:val="32"/>
-            <w:u w:val="none"/>
-            <w:lang w:val="es-ES_tradnl"/>
-          </w:rPr>
-          <w:t>jos_practicos.git</w:t>
+          <w:t>https://github.com/lucianoaltamirano435-rgb/Grupo_3_Trabajos_practicos.git</w:t>
         </w:r>
       </w:hyperlink>
     </w:p>
@@ -876,13 +848,6 @@
         </w:rPr>
         <w:t>.</w:t>
       </w:r>
-      <w:r>
-        <w:rPr>
-          <w:szCs w:val="20"/>
-          <w:lang w:val="es-US"/>
-        </w:rPr>
-        <w:t xml:space="preserve"> Se explica la selección y armonización de las variables, la recalibración de los valores inexistentes o incoherentes y la actualización de los valores de ingresos de acuerdo con la inflación interanual.</w:t>
-      </w:r>
     </w:p>
     <w:p>
       <w:pPr>
@@ -1499,14 +1464,7 @@
         <w:rPr>
           <w:szCs w:val="20"/>
         </w:rPr>
-        <w:t xml:space="preserve"> no </w:t>
-      </w:r>
-      <w:r>
-        <w:rPr>
-          <w:szCs w:val="20"/>
-        </w:rPr>
-        <w:lastRenderedPageBreak/>
-        <w:t>está en condiciones de responder este tipo de preguntas. En relación con los ingresos, es probable que una parte considerable de este grupo haya declarado un valor de cero, lo cual no equivale a un valor nulo (-9).</w:t>
+        <w:t xml:space="preserve"> no está en condiciones de responder este tipo de preguntas. En relación con los ingresos, es probable que una parte considerable de este grupo haya declarado un valor de cero, lo cual no equivale a un valor nulo (-9).</w:t>
       </w:r>
     </w:p>
     <w:p>
@@ -1520,6 +1478,7 @@
         <w:rPr>
           <w:szCs w:val="20"/>
         </w:rPr>
+        <w:lastRenderedPageBreak/>
         <w:t xml:space="preserve">Por otro lado, en la base "ocupados" se observa un incremento en el porcentaje de valores faltantes </w:t>
       </w:r>
       <w:r>
@@ -1638,13 +1597,14 @@
       </w:pPr>
       <w:r>
         <w:rPr>
+          <w:noProof/>
           <w:sz w:val="20"/>
           <w:szCs w:val="20"/>
         </w:rPr>
         <w:drawing>
-          <wp:inline distT="0" distB="0" distL="0" distR="0" wp14:anchorId="5577414C" wp14:editId="64D2303F">
-            <wp:extent cx="3244215" cy="1990579"/>
-            <wp:effectExtent l="0" t="0" r="0" b="3810"/>
+          <wp:inline distT="0" distB="0" distL="0" distR="0" wp14:anchorId="5577414C" wp14:editId="56026F10">
+            <wp:extent cx="3243418" cy="2257865"/>
+            <wp:effectExtent l="0" t="0" r="0" b="3175"/>
             <wp:docPr id="921613015" name="Imagen 1"/>
             <wp:cNvGraphicFramePr>
               <a:graphicFrameLocks xmlns:a="http://schemas.openxmlformats.org/drawingml/2006/main" noChangeAspect="1"/>
@@ -1665,7 +1625,7 @@
                   <pic:spPr>
                     <a:xfrm>
                       <a:off x="0" y="0"/>
-                      <a:ext cx="3247664" cy="1992696"/>
+                      <a:ext cx="3252807" cy="2264401"/>
                     </a:xfrm>
                     <a:prstGeom prst="rect">
                       <a:avLst/>
@@ -1770,360 +1730,428 @@
           <w:szCs w:val="20"/>
           <w:lang w:val="es-US"/>
         </w:rPr>
-        <w:t>Con el objetivo de caracterizar la población ocupada que se corresponde con la reflejada en la EPH de los cuartos trimestres de 2024-2025, se realiza un conjunto de ejercicios exploratorios para identificar patrones, asociaciones y distribuciones de las variables seleccionadas. La metodología de trabajo consiste en la construcción de matrices de correlación para variables categóricas y continuas, y en la elaboración de estadísticos descriptivos que permiten observar la forma de la dispersión, la centralidad y la distribución. Por lo tanto, los resultados obtenidos en esta fase constituyen un insumo para la interpretación y la guía de los análisis de informalidad laboral que se realizan en las fases posteriores del presente informe.</w:t>
+        <w:t xml:space="preserve">A fin de estudiar las relaciones online entre las variables </w:t>
+      </w:r>
+      <w:r>
+        <w:rPr>
+          <w:szCs w:val="20"/>
+          <w:lang w:val="es-US"/>
+        </w:rPr>
+        <w:t>selecciona</w:t>
+      </w:r>
+      <w:r>
+        <w:rPr>
+          <w:szCs w:val="20"/>
+          <w:lang w:val="es-US"/>
+        </w:rPr>
+        <w:t xml:space="preserve">das, se construyeron matrices de correlación </w:t>
+      </w:r>
+      <w:r>
+        <w:rPr>
+          <w:szCs w:val="20"/>
+          <w:lang w:val="es-US"/>
+        </w:rPr>
+        <w:t>correspondientes a</w:t>
+      </w:r>
+      <w:r>
+        <w:rPr>
+          <w:szCs w:val="20"/>
+          <w:lang w:val="es-US"/>
+        </w:rPr>
+        <w:t xml:space="preserve"> los dos últimos trimestres de 2024 y 2025, </w:t>
+      </w:r>
+      <w:r>
+        <w:rPr>
+          <w:szCs w:val="20"/>
+          <w:lang w:val="es-US"/>
+        </w:rPr>
+        <w:t>que incluyeron</w:t>
+      </w:r>
+      <w:r>
+        <w:rPr>
+          <w:szCs w:val="20"/>
+          <w:lang w:val="es-US"/>
+        </w:rPr>
+        <w:t xml:space="preserve"> variables binarias y continuas. Las respuestas reflejan </w:t>
+      </w:r>
+      <w:r>
+        <w:rPr>
+          <w:szCs w:val="20"/>
+          <w:lang w:val="es-US"/>
+        </w:rPr>
+        <w:t>cierta</w:t>
+      </w:r>
+      <w:r>
+        <w:rPr>
+          <w:szCs w:val="20"/>
+          <w:lang w:val="es-US"/>
+        </w:rPr>
+        <w:t xml:space="preserve"> homogeneidad entre ambas aplicaciones sin diferencias significativas en la estructura de las correlaciones. De hecho, se evidencian </w:t>
+      </w:r>
+      <w:r>
+        <w:rPr>
+          <w:szCs w:val="20"/>
+          <w:lang w:val="es-US"/>
+        </w:rPr>
+        <w:t>asociaciones</w:t>
+      </w:r>
+      <w:r>
+        <w:rPr>
+          <w:szCs w:val="20"/>
+          <w:lang w:val="es-US"/>
+        </w:rPr>
+        <w:t xml:space="preserve"> fuertes entre las variables de ingresos analizadas, y asociaciones de menor fuerza entre la cobertura y el sector de ocupación, y entre estos y los niveles de ingreso. En cambio, no </w:t>
+      </w:r>
+      <w:r>
+        <w:rPr>
+          <w:szCs w:val="20"/>
+          <w:lang w:val="es-US"/>
+        </w:rPr>
+        <w:t xml:space="preserve">se </w:t>
+      </w:r>
+      <w:r>
+        <w:rPr>
+          <w:szCs w:val="20"/>
+          <w:lang w:val="es-US"/>
+        </w:rPr>
+        <w:t>identific</w:t>
+      </w:r>
+      <w:r>
+        <w:rPr>
+          <w:szCs w:val="20"/>
+          <w:lang w:val="es-US"/>
+        </w:rPr>
+        <w:t>an</w:t>
+      </w:r>
+      <w:r>
+        <w:rPr>
+          <w:szCs w:val="20"/>
+          <w:lang w:val="es-US"/>
+        </w:rPr>
+        <w:t xml:space="preserve"> vínculos relevantes entre las variables de estado civil y sexo que justifiquen un análisis más a fondo</w:t>
+      </w:r>
+      <w:r>
+        <w:rPr>
+          <w:szCs w:val="20"/>
+          <w:lang w:val="es-US"/>
+        </w:rPr>
+        <w:t>.</w:t>
       </w:r>
     </w:p>
     <w:p>
       <w:pPr>
-        <w:rPr>
-          <w:szCs w:val="20"/>
-          <w:lang w:val="es-US"/>
-        </w:rPr>
-      </w:pPr>
-      <w:r>
-        <w:rPr>
-          <w:szCs w:val="20"/>
-          <w:lang w:val="es-US"/>
-        </w:rPr>
-        <w:t xml:space="preserve">A fin de estudiar las relaciones online entre las variables </w:t>
-      </w:r>
-      <w:r>
-        <w:rPr>
-          <w:szCs w:val="20"/>
-          <w:lang w:val="es-US"/>
-        </w:rPr>
-        <w:t>selecciona</w:t>
-      </w:r>
-      <w:r>
-        <w:rPr>
-          <w:szCs w:val="20"/>
-          <w:lang w:val="es-US"/>
-        </w:rPr>
-        <w:t xml:space="preserve">das, se construyeron matrices de correlación </w:t>
-      </w:r>
-      <w:r>
-        <w:rPr>
-          <w:szCs w:val="20"/>
-          <w:lang w:val="es-US"/>
-        </w:rPr>
-        <w:t>correspondientes a</w:t>
-      </w:r>
-      <w:r>
-        <w:rPr>
-          <w:szCs w:val="20"/>
-          <w:lang w:val="es-US"/>
-        </w:rPr>
-        <w:t xml:space="preserve"> los dos últimos trimestres de 2024 y 2025, </w:t>
-      </w:r>
-      <w:r>
-        <w:rPr>
-          <w:szCs w:val="20"/>
-          <w:lang w:val="es-US"/>
-        </w:rPr>
-        <w:t>que incluyeron</w:t>
-      </w:r>
-      <w:r>
-        <w:rPr>
-          <w:szCs w:val="20"/>
-          <w:lang w:val="es-US"/>
-        </w:rPr>
-        <w:t xml:space="preserve"> variables binarias y continuas. Las respuestas reflejan </w:t>
-      </w:r>
-      <w:r>
-        <w:rPr>
-          <w:szCs w:val="20"/>
-          <w:lang w:val="es-US"/>
-        </w:rPr>
-        <w:t>cierta</w:t>
-      </w:r>
-      <w:r>
-        <w:rPr>
-          <w:szCs w:val="20"/>
-          <w:lang w:val="es-US"/>
-        </w:rPr>
-        <w:t xml:space="preserve"> homogeneidad entre ambas aplicaciones sin diferencias significativas en la estructura de las correlaciones. De hecho, se evidencian </w:t>
-      </w:r>
-      <w:r>
-        <w:rPr>
-          <w:szCs w:val="20"/>
-          <w:lang w:val="es-US"/>
-        </w:rPr>
-        <w:t>asociaciones</w:t>
-      </w:r>
-      <w:r>
-        <w:rPr>
-          <w:szCs w:val="20"/>
-          <w:lang w:val="es-US"/>
-        </w:rPr>
-        <w:t xml:space="preserve"> fuertes entre las variables de ingresos analizadas, y asociaciones de menor fuerza entre la cobertura y el sector de ocupación, y entre estos y los niveles de ingreso. En cambio, no </w:t>
-      </w:r>
-      <w:r>
-        <w:rPr>
-          <w:szCs w:val="20"/>
-          <w:lang w:val="es-US"/>
-        </w:rPr>
-        <w:t xml:space="preserve">se </w:t>
-      </w:r>
-      <w:r>
-        <w:rPr>
-          <w:szCs w:val="20"/>
-          <w:lang w:val="es-US"/>
-        </w:rPr>
-        <w:t>identific</w:t>
-      </w:r>
-      <w:r>
-        <w:rPr>
-          <w:szCs w:val="20"/>
-          <w:lang w:val="es-US"/>
-        </w:rPr>
-        <w:t>an</w:t>
-      </w:r>
-      <w:r>
-        <w:rPr>
-          <w:szCs w:val="20"/>
-          <w:lang w:val="es-US"/>
-        </w:rPr>
-        <w:t xml:space="preserve"> vínculos relevantes entre las variables de estado civil y sexo que justifiquen un análisis más a fondo</w:t>
-      </w:r>
-      <w:r>
-        <w:rPr>
-          <w:szCs w:val="20"/>
-          <w:lang w:val="es-US"/>
-        </w:rPr>
-        <w:t>.</w:t>
+        <w:spacing w:after="0"/>
+        <w:rPr>
+          <w:szCs w:val="20"/>
+        </w:rPr>
+      </w:pPr>
+      <w:r>
+        <w:rPr>
+          <w:szCs w:val="20"/>
+          <w:lang w:val="es-US"/>
+        </w:rPr>
+        <w:t>La</w:t>
+      </w:r>
+      <w:r>
+        <w:rPr>
+          <w:szCs w:val="20"/>
+          <w:lang w:val="es-US"/>
+        </w:rPr>
+        <w:t>s</w:t>
+      </w:r>
+      <w:r>
+        <w:rPr>
+          <w:szCs w:val="20"/>
+          <w:lang w:val="es-US"/>
+        </w:rPr>
+        <w:t xml:space="preserve"> matr</w:t>
+      </w:r>
+      <w:r>
+        <w:rPr>
+          <w:szCs w:val="20"/>
+          <w:lang w:val="es-US"/>
+        </w:rPr>
+        <w:t>ices</w:t>
+      </w:r>
+      <w:r>
+        <w:rPr>
+          <w:szCs w:val="20"/>
+          <w:lang w:val="es-US"/>
+        </w:rPr>
+        <w:t xml:space="preserve"> de correlación presentada</w:t>
+      </w:r>
+      <w:r>
+        <w:rPr>
+          <w:szCs w:val="20"/>
+          <w:lang w:val="es-US"/>
+        </w:rPr>
+        <w:t>s</w:t>
+      </w:r>
+      <w:r>
+        <w:rPr>
+          <w:szCs w:val="20"/>
+          <w:lang w:val="es-US"/>
+        </w:rPr>
+        <w:t xml:space="preserve"> se </w:t>
+      </w:r>
+      <w:r>
+        <w:rPr>
+          <w:szCs w:val="20"/>
+          <w:lang w:val="es-US"/>
+        </w:rPr>
+        <w:t>construy</w:t>
+      </w:r>
+      <w:r>
+        <w:rPr>
+          <w:szCs w:val="20"/>
+          <w:lang w:val="es-US"/>
+        </w:rPr>
+        <w:t>e</w:t>
+      </w:r>
+      <w:r>
+        <w:rPr>
+          <w:szCs w:val="20"/>
+          <w:lang w:val="es-US"/>
+        </w:rPr>
+        <w:t>n</w:t>
+      </w:r>
+      <w:r>
+        <w:rPr>
+          <w:szCs w:val="20"/>
+          <w:lang w:val="es-US"/>
+        </w:rPr>
+        <w:t xml:space="preserve"> </w:t>
+      </w:r>
+      <w:r>
+        <w:rPr>
+          <w:szCs w:val="20"/>
+          <w:lang w:val="es-US"/>
+        </w:rPr>
+        <w:t>a partir de</w:t>
+      </w:r>
+      <w:r>
+        <w:rPr>
+          <w:szCs w:val="20"/>
+          <w:lang w:val="es-US"/>
+        </w:rPr>
+        <w:t xml:space="preserve"> variables dicotómicas </w:t>
+      </w:r>
+      <w:r>
+        <w:rPr>
+          <w:szCs w:val="20"/>
+          <w:lang w:val="es-US"/>
+        </w:rPr>
+        <w:t>y continuas</w:t>
+      </w:r>
+      <w:r>
+        <w:rPr>
+          <w:rStyle w:val="Refdenotaalpie"/>
+          <w:szCs w:val="20"/>
+          <w:lang w:val="es-US"/>
+        </w:rPr>
+        <w:footnoteReference w:id="1"/>
+      </w:r>
+      <w:r>
+        <w:rPr>
+          <w:szCs w:val="20"/>
+          <w:lang w:val="es-US"/>
+        </w:rPr>
+        <w:t xml:space="preserve">. </w:t>
+      </w:r>
+      <w:r>
+        <w:rPr>
+          <w:szCs w:val="20"/>
+        </w:rPr>
+        <w:t xml:space="preserve">Los resultados obtenidos </w:t>
+      </w:r>
+      <w:r>
+        <w:rPr>
+          <w:szCs w:val="20"/>
+        </w:rPr>
+        <w:t>so</w:t>
+      </w:r>
+      <w:r>
+        <w:rPr>
+          <w:szCs w:val="20"/>
+        </w:rPr>
+        <w:t>n interesantes por diversos motivos</w:t>
+      </w:r>
+      <w:r>
+        <w:rPr>
+          <w:szCs w:val="20"/>
+        </w:rPr>
+        <w:t xml:space="preserve"> (véase la figura 2)</w:t>
+      </w:r>
+      <w:r>
+        <w:rPr>
+          <w:szCs w:val="20"/>
+        </w:rPr>
+        <w:t xml:space="preserve">. En primer lugar, no se observan diferencias sustanciales entre ambos años, lo </w:t>
+      </w:r>
+      <w:r>
+        <w:rPr>
+          <w:szCs w:val="20"/>
+        </w:rPr>
+        <w:t>que</w:t>
+      </w:r>
+      <w:r>
+        <w:rPr>
+          <w:szCs w:val="20"/>
+        </w:rPr>
+        <w:t xml:space="preserve"> evidencia, de manera exploratoria, cierta estabilidad en las relaciones lineales entre las variables analizadas. En segundo lugar, se aprecia, como </w:t>
+      </w:r>
+      <w:r>
+        <w:rPr>
+          <w:szCs w:val="20"/>
+        </w:rPr>
+        <w:t>cabía</w:t>
+      </w:r>
+      <w:r>
+        <w:rPr>
+          <w:szCs w:val="20"/>
+        </w:rPr>
+        <w:t xml:space="preserve"> esperar</w:t>
+      </w:r>
+      <w:r>
+        <w:rPr>
+          <w:szCs w:val="20"/>
+        </w:rPr>
+        <w:t xml:space="preserve">, una relación positiva </w:t>
+      </w:r>
+      <w:r>
+        <w:rPr>
+          <w:szCs w:val="20"/>
+        </w:rPr>
+        <w:t xml:space="preserve">marcada </w:t>
+      </w:r>
+      <w:r>
+        <w:rPr>
+          <w:szCs w:val="20"/>
+        </w:rPr>
+        <w:t>entre las dos variables de ingreso consideradas (ingreso de la ocupación principal e ingreso total). De forma similar, aunque con menor intensidad, se identifica una asociación entre cobertura médica (</w:t>
+      </w:r>
+      <w:proofErr w:type="spellStart"/>
+      <w:r>
+        <w:rPr>
+          <w:szCs w:val="20"/>
+        </w:rPr>
+        <w:t>cobertura_med</w:t>
+      </w:r>
+      <w:proofErr w:type="spellEnd"/>
+      <w:r>
+        <w:rPr>
+          <w:szCs w:val="20"/>
+        </w:rPr>
+        <w:t xml:space="preserve">, donde 1 equivale a cobertura y 2 a no cobertura) y sector laboral (sector_2, donde 1 corresponde a formal y 2 a informal), lo que sugiere la existencia de relaciones lineales entre ambas variables. En esa misma línea, se detectan indicios de </w:t>
+      </w:r>
+      <w:r>
+        <w:rPr>
+          <w:szCs w:val="20"/>
+        </w:rPr>
+        <w:t xml:space="preserve">una </w:t>
+      </w:r>
+      <w:r>
+        <w:rPr>
+          <w:szCs w:val="20"/>
+        </w:rPr>
+        <w:t>correlación entre los ingresos y la cobertura médica.</w:t>
       </w:r>
     </w:p>
     <w:p>
       <w:pPr>
-        <w:spacing w:after="0"/>
-        <w:rPr>
-          <w:szCs w:val="20"/>
-        </w:rPr>
-      </w:pPr>
-      <w:r>
-        <w:rPr>
-          <w:szCs w:val="20"/>
-          <w:lang w:val="es-US"/>
-        </w:rPr>
-        <w:t>La</w:t>
-      </w:r>
-      <w:r>
-        <w:rPr>
-          <w:szCs w:val="20"/>
-          <w:lang w:val="es-US"/>
-        </w:rPr>
+        <w:spacing w:before="240"/>
+      </w:pPr>
+      <w:r>
+        <w:t>Respecto a los estadísticos descriptivos preliminares (ver Anexo 2), co</w:t>
+      </w:r>
+      <w:r>
+        <w:t>nvien</w:t>
+      </w:r>
+      <w:r>
+        <w:t>e señalar dos aspectos previos. Primero, dada la naturaleza</w:t>
+      </w:r>
+      <w:r>
+        <w:t xml:space="preserve"> distinta</w:t>
+      </w:r>
+      <w:r>
+        <w:t xml:space="preserve"> de las variables, su tratamiento difiere: no </w:t>
+      </w:r>
+      <w:r>
+        <w:t>es</w:t>
+      </w:r>
+      <w:r>
+        <w:t xml:space="preserve"> posible calcular percentiles para variables categóricas, por lo que en estos casos se presentan únicamente tablas de frecuencias. Segundo, en cuanto a la no correspondencia o filtrado previo, antes de generar los resultados descriptivos se etiquetaron las variables, de modo que las personas a quienes no</w:t>
+      </w:r>
+      <w:r>
+        <w:t xml:space="preserve"> les</w:t>
+      </w:r>
+      <w:r>
+        <w:t xml:space="preserve"> correspondía responder determinada pregunta quedaron codificadas como NaN. Esto no debe confundirse con el problema de datos faltantes </w:t>
+      </w:r>
+      <w:r>
+        <w:t>d</w:t>
+      </w:r>
+      <w:r>
+        <w:t xml:space="preserve">el </w:t>
+      </w:r>
+      <w:proofErr w:type="spellStart"/>
+      <w:r>
+        <w:rPr>
+          <w:i/>
+          <w:iCs/>
+        </w:rPr>
+        <w:t>heatmap</w:t>
+      </w:r>
+      <w:proofErr w:type="spellEnd"/>
+      <w:r>
+        <w:t xml:space="preserve">, </w:t>
+      </w:r>
+      <w:r>
+        <w:lastRenderedPageBreak/>
+        <w:t xml:space="preserve">pues aquí se trata </w:t>
+      </w:r>
+      <w:r>
+        <w:t>sólo</w:t>
+      </w:r>
+      <w:r>
+        <w:t xml:space="preserve"> de una codificación según la correspondencia adecuada; por ejemplo, </w:t>
+      </w:r>
+      <w:r>
+        <w:t xml:space="preserve">el </w:t>
+      </w:r>
+      <w:r>
+        <w:t>descuento jubilatorio solo debe ser respondid</w:t>
+      </w:r>
+      <w:r>
+        <w:t>o</w:t>
+      </w:r>
+      <w:r>
+        <w:t xml:space="preserve"> por quienes fueron previamente identificados como asalariados, de allí el número de </w:t>
+      </w:r>
+      <w:r>
+        <w:t>'</w:t>
+      </w:r>
+      <w:r>
+        <w:t>NaN</w:t>
+      </w:r>
+      <w:r>
+        <w:t>'</w:t>
+      </w:r>
+      <w:r>
+        <w:t xml:space="preserve"> presente</w:t>
+      </w:r>
+      <w:r>
         <w:t>s</w:t>
       </w:r>
       <w:r>
-        <w:rPr>
-          <w:szCs w:val="20"/>
-          <w:lang w:val="es-US"/>
-        </w:rPr>
-        <w:t xml:space="preserve"> matr</w:t>
-      </w:r>
-      <w:r>
-        <w:rPr>
-          <w:szCs w:val="20"/>
-          <w:lang w:val="es-US"/>
-        </w:rPr>
-        <w:t>ices</w:t>
-      </w:r>
-      <w:r>
-        <w:rPr>
-          <w:szCs w:val="20"/>
-          <w:lang w:val="es-US"/>
-        </w:rPr>
-        <w:t xml:space="preserve"> de correlación presentada</w:t>
-      </w:r>
-      <w:r>
-        <w:rPr>
-          <w:szCs w:val="20"/>
-          <w:lang w:val="es-US"/>
-        </w:rPr>
-        <w:t>s</w:t>
-      </w:r>
-      <w:r>
-        <w:rPr>
-          <w:szCs w:val="20"/>
-          <w:lang w:val="es-US"/>
-        </w:rPr>
-        <w:t xml:space="preserve"> se </w:t>
-      </w:r>
-      <w:r>
-        <w:rPr>
-          <w:szCs w:val="20"/>
-          <w:lang w:val="es-US"/>
-        </w:rPr>
-        <w:t>construy</w:t>
-      </w:r>
-      <w:r>
-        <w:rPr>
-          <w:szCs w:val="20"/>
-          <w:lang w:val="es-US"/>
-        </w:rPr>
-        <w:t>e</w:t>
-      </w:r>
-      <w:r>
-        <w:rPr>
-          <w:szCs w:val="20"/>
-          <w:lang w:val="es-US"/>
-        </w:rPr>
-        <w:t>n</w:t>
-      </w:r>
-      <w:r>
-        <w:rPr>
-          <w:szCs w:val="20"/>
-          <w:lang w:val="es-US"/>
-        </w:rPr>
-        <w:t xml:space="preserve"> </w:t>
-      </w:r>
-      <w:r>
-        <w:rPr>
-          <w:szCs w:val="20"/>
-          <w:lang w:val="es-US"/>
-        </w:rPr>
-        <w:t>a partir de</w:t>
-      </w:r>
-      <w:r>
-        <w:rPr>
-          <w:szCs w:val="20"/>
-          <w:lang w:val="es-US"/>
-        </w:rPr>
-        <w:t xml:space="preserve"> variables dicotómicas </w:t>
-      </w:r>
-      <w:r>
-        <w:rPr>
-          <w:szCs w:val="20"/>
-          <w:lang w:val="es-US"/>
-        </w:rPr>
-        <w:t>y continuas</w:t>
-      </w:r>
-      <w:r>
-        <w:rPr>
-          <w:rStyle w:val="Refdenotaalpie"/>
-          <w:szCs w:val="20"/>
-          <w:lang w:val="es-US"/>
-        </w:rPr>
-        <w:footnoteReference w:id="1"/>
-      </w:r>
-      <w:r>
-        <w:rPr>
-          <w:szCs w:val="20"/>
-          <w:lang w:val="es-US"/>
-        </w:rPr>
-        <w:t xml:space="preserve">. </w:t>
-      </w:r>
-      <w:r>
-        <w:rPr>
-          <w:szCs w:val="20"/>
-        </w:rPr>
-        <w:t xml:space="preserve">Los resultados obtenidos </w:t>
-      </w:r>
-      <w:r>
-        <w:rPr>
-          <w:szCs w:val="20"/>
-        </w:rPr>
-        <w:t>so</w:t>
-      </w:r>
-      <w:r>
-        <w:rPr>
-          <w:szCs w:val="20"/>
-        </w:rPr>
-        <w:t>n interesantes por diversos motivos</w:t>
-      </w:r>
-      <w:r>
-        <w:rPr>
-          <w:szCs w:val="20"/>
-        </w:rPr>
-        <w:t xml:space="preserve"> (véase la figura 2)</w:t>
-      </w:r>
-      <w:r>
-        <w:rPr>
-          <w:szCs w:val="20"/>
-        </w:rPr>
-        <w:t xml:space="preserve">. En primer lugar, no se observan diferencias sustanciales entre ambos años, lo </w:t>
-      </w:r>
-      <w:r>
-        <w:rPr>
-          <w:szCs w:val="20"/>
-        </w:rPr>
-        <w:t>que</w:t>
-      </w:r>
-      <w:r>
-        <w:rPr>
-          <w:szCs w:val="20"/>
-        </w:rPr>
-        <w:t xml:space="preserve"> evidencia, de manera exploratoria, cierta estabilidad en las relaciones lineales entre las variables analizadas. En segundo lugar, se aprecia, como </w:t>
-      </w:r>
-      <w:r>
-        <w:rPr>
-          <w:szCs w:val="20"/>
-        </w:rPr>
-        <w:t>cabía</w:t>
-      </w:r>
-      <w:r>
-        <w:rPr>
-          <w:szCs w:val="20"/>
-        </w:rPr>
-        <w:t xml:space="preserve"> esperar</w:t>
-      </w:r>
-      <w:r>
-        <w:rPr>
-          <w:szCs w:val="20"/>
-        </w:rPr>
-        <w:t xml:space="preserve">, una relación positiva </w:t>
-      </w:r>
-      <w:r>
-        <w:rPr>
-          <w:szCs w:val="20"/>
-        </w:rPr>
-        <w:t xml:space="preserve">marcada </w:t>
-      </w:r>
-      <w:r>
-        <w:rPr>
-          <w:szCs w:val="20"/>
-        </w:rPr>
-        <w:t>entre las dos variables de ingreso consideradas (ingreso de la ocupación principal e ingreso total). De forma similar, aunque con menor intensidad, se identifica una asociación entre cobertura médica (</w:t>
-      </w:r>
-      <w:proofErr w:type="spellStart"/>
-      <w:r>
-        <w:rPr>
-          <w:szCs w:val="20"/>
-        </w:rPr>
-        <w:t>cobertura_med</w:t>
-      </w:r>
-      <w:proofErr w:type="spellEnd"/>
-      <w:r>
-        <w:rPr>
-          <w:szCs w:val="20"/>
-        </w:rPr>
-        <w:t xml:space="preserve">, donde 1 equivale a cobertura y 2 a no cobertura) y sector laboral (sector_2, donde 1 corresponde a formal y 2 a </w:t>
-      </w:r>
-      <w:r>
-        <w:rPr>
-          <w:szCs w:val="20"/>
-        </w:rPr>
-        <w:lastRenderedPageBreak/>
-        <w:t xml:space="preserve">informal), lo que sugiere la existencia de relaciones lineales entre ambas variables. En esa misma línea, se detectan indicios de </w:t>
-      </w:r>
-      <w:r>
-        <w:rPr>
-          <w:szCs w:val="20"/>
-        </w:rPr>
-        <w:t xml:space="preserve">una </w:t>
-      </w:r>
-      <w:r>
-        <w:rPr>
-          <w:szCs w:val="20"/>
-        </w:rPr>
-        <w:t>correlación entre los ingresos y la cobertura médica. Por el contrario, variables como el estado civil y el sexo de la persona no muestran relaciones relevantes que ameriten un análisis más profundo en instancias posteriores.</w:t>
+        <w:t xml:space="preserve"> en las tablas.</w:t>
       </w:r>
     </w:p>
     <w:p>
       <w:pPr>
         <w:pStyle w:val="Descripcin"/>
         <w:keepNext/>
-        <w:ind w:left="851" w:right="849"/>
+        <w:ind w:left="1701" w:right="1274"/>
         <w:rPr>
           <w:szCs w:val="20"/>
         </w:rPr>
@@ -2199,13 +2227,14 @@
       </w:pPr>
       <w:r>
         <w:rPr>
+          <w:noProof/>
           <w:sz w:val="20"/>
           <w:szCs w:val="20"/>
         </w:rPr>
         <w:drawing>
-          <wp:inline distT="0" distB="0" distL="0" distR="0" wp14:anchorId="610AD8A8" wp14:editId="7826A18F">
-            <wp:extent cx="5065672" cy="1899138"/>
-            <wp:effectExtent l="0" t="0" r="1905" b="6350"/>
+          <wp:inline distT="0" distB="0" distL="0" distR="0" wp14:anchorId="478EEF38" wp14:editId="1F9BFD50">
+            <wp:extent cx="4459458" cy="1722755"/>
+            <wp:effectExtent l="0" t="0" r="0" b="4445"/>
             <wp:docPr id="428947222" name="Imagen 1"/>
             <wp:cNvGraphicFramePr>
               <a:graphicFrameLocks xmlns:a="http://schemas.openxmlformats.org/drawingml/2006/main" noChangeAspect="1"/>
@@ -2227,7 +2256,7 @@
                   <pic:spPr bwMode="auto">
                     <a:xfrm>
                       <a:off x="0" y="0"/>
-                      <a:ext cx="5183439" cy="1943289"/>
+                      <a:ext cx="4500708" cy="1738690"/>
                     </a:xfrm>
                     <a:prstGeom prst="rect">
                       <a:avLst/>
@@ -2250,8 +2279,7 @@
     </w:p>
     <w:p>
       <w:pPr>
-        <w:spacing w:line="240" w:lineRule="auto"/>
-        <w:ind w:left="851" w:right="849"/>
+        <w:ind w:left="1701" w:right="1699"/>
         <w:rPr>
           <w:szCs w:val="20"/>
           <w:lang w:val="es-US"/>
@@ -2284,7 +2312,7 @@
           <w:tag w:val="MENDELEY_CITATION_v3_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"/>
           <w:id w:val="-1435514705"/>
           <w:placeholder>
-            <w:docPart w:val="01B83E5E14260C4898E3FC02EE44A5EC"/>
+            <w:docPart w:val="6796B5EBE6279F48AA0BC0D6F950B8E2"/>
           </w:placeholder>
         </w:sdtPr>
         <w:sdtContent>
@@ -2307,168 +2335,6 @@
           <w:lang w:val="es-US"/>
         </w:rPr>
         <w:t>.</w:t>
-      </w:r>
-    </w:p>
-    <w:p>
-      <w:pPr>
-        <w:rPr>
-          <w:szCs w:val="20"/>
-          <w:lang w:val="es-US"/>
-        </w:rPr>
-      </w:pPr>
-      <w:r>
-        <w:rPr>
-          <w:szCs w:val="20"/>
-        </w:rPr>
-        <w:t>Respecto a los estadísticos descriptivos preliminares (ver Anexo 2), co</w:t>
-      </w:r>
-      <w:r>
-        <w:rPr>
-          <w:szCs w:val="20"/>
-        </w:rPr>
-        <w:t>nvien</w:t>
-      </w:r>
-      <w:r>
-        <w:rPr>
-          <w:szCs w:val="20"/>
-        </w:rPr>
-        <w:t>e señalar dos aspectos previos. Primero, dada la naturaleza</w:t>
-      </w:r>
-      <w:r>
-        <w:rPr>
-          <w:szCs w:val="20"/>
-        </w:rPr>
-        <w:t xml:space="preserve"> distinta</w:t>
-      </w:r>
-      <w:r>
-        <w:rPr>
-          <w:szCs w:val="20"/>
-        </w:rPr>
-        <w:t xml:space="preserve"> de las variables, su tratamiento difiere: no </w:t>
-      </w:r>
-      <w:r>
-        <w:rPr>
-          <w:szCs w:val="20"/>
-        </w:rPr>
-        <w:t>es</w:t>
-      </w:r>
-      <w:r>
-        <w:rPr>
-          <w:szCs w:val="20"/>
-        </w:rPr>
-        <w:t xml:space="preserve"> posible calcular percentiles para variables categóricas, por lo que en estos casos se presentan únicamente tablas de frecuencias. Segundo, en cuanto a la no correspondencia o filtrado previo, antes de generar los resultados descriptivos se etiquetaron las variables, de modo que las personas a quienes no</w:t>
-      </w:r>
-      <w:r>
-        <w:rPr>
-          <w:szCs w:val="20"/>
-        </w:rPr>
-        <w:t xml:space="preserve"> les</w:t>
-      </w:r>
-      <w:r>
-        <w:rPr>
-          <w:szCs w:val="20"/>
-        </w:rPr>
-        <w:t xml:space="preserve"> correspondía responder determinada pregunta quedaron codificadas como NaN. Esto no debe confundirse con el problema de datos faltantes </w:t>
-      </w:r>
-      <w:r>
-        <w:rPr>
-          <w:szCs w:val="20"/>
-        </w:rPr>
-        <w:t>d</w:t>
-      </w:r>
-      <w:r>
-        <w:rPr>
-          <w:szCs w:val="20"/>
-        </w:rPr>
-        <w:t xml:space="preserve">el </w:t>
-      </w:r>
-      <w:proofErr w:type="spellStart"/>
-      <w:r>
-        <w:rPr>
-          <w:i/>
-          <w:iCs/>
-          <w:szCs w:val="20"/>
-        </w:rPr>
-        <w:t>heatmap</w:t>
-      </w:r>
-      <w:proofErr w:type="spellEnd"/>
-      <w:r>
-        <w:rPr>
-          <w:szCs w:val="20"/>
-        </w:rPr>
-        <w:t xml:space="preserve">, pues aquí se trata </w:t>
-      </w:r>
-      <w:r>
-        <w:rPr>
-          <w:szCs w:val="20"/>
-        </w:rPr>
-        <w:t>sólo</w:t>
-      </w:r>
-      <w:r>
-        <w:rPr>
-          <w:szCs w:val="20"/>
-        </w:rPr>
-        <w:t xml:space="preserve"> de una codificación según la correspondencia adecuada; por ejemplo, </w:t>
-      </w:r>
-      <w:r>
-        <w:rPr>
-          <w:szCs w:val="20"/>
-        </w:rPr>
-        <w:t xml:space="preserve">el </w:t>
-      </w:r>
-      <w:r>
-        <w:rPr>
-          <w:szCs w:val="20"/>
-        </w:rPr>
-        <w:t>descuento jubilatorio solo debe ser respondid</w:t>
-      </w:r>
-      <w:r>
-        <w:rPr>
-          <w:szCs w:val="20"/>
-        </w:rPr>
-        <w:t>o</w:t>
-      </w:r>
-      <w:r>
-        <w:rPr>
-          <w:szCs w:val="20"/>
-        </w:rPr>
-        <w:t xml:space="preserve"> por quienes fueron previamente identificados como asalariados, de allí el número de </w:t>
-      </w:r>
-      <w:r>
-        <w:rPr>
-          <w:szCs w:val="20"/>
-        </w:rPr>
-        <w:t>'</w:t>
-      </w:r>
-      <w:r>
-        <w:rPr>
-          <w:szCs w:val="20"/>
-        </w:rPr>
-        <w:t>NaN</w:t>
-      </w:r>
-      <w:r>
-        <w:rPr>
-          <w:szCs w:val="20"/>
-        </w:rPr>
-        <w:t>'</w:t>
-      </w:r>
-      <w:r>
-        <w:rPr>
-          <w:szCs w:val="20"/>
-        </w:rPr>
-        <w:t xml:space="preserve"> presente</w:t>
-      </w:r>
-      <w:r>
-        <w:rPr>
-          <w:szCs w:val="20"/>
-        </w:rPr>
-        <w:t>s</w:t>
-      </w:r>
-      <w:r>
-        <w:rPr>
-          <w:szCs w:val="20"/>
-        </w:rPr>
-        <w:t xml:space="preserve"> en las tablas.</w:t>
       </w:r>
     </w:p>
     <w:p>
@@ -5028,162 +4894,7 @@
           <w:szCs w:val="20"/>
           <w:lang w:val="es-US"/>
         </w:rPr>
-        <w:lastRenderedPageBreak/>
-        <w:t xml:space="preserve">En cuanto a los cuartos trimestres de 2024 y 2025, la tasa de informalidad </w:t>
-      </w:r>
-      <w:r>
-        <w:rPr>
-          <w:szCs w:val="20"/>
-          <w:lang w:val="es-US"/>
-        </w:rPr>
-        <w:t>de</w:t>
-      </w:r>
-      <w:r>
-        <w:rPr>
-          <w:szCs w:val="20"/>
-          <w:lang w:val="es-US"/>
-        </w:rPr>
-        <w:t xml:space="preserve"> la población ocupada urbana de Argentina está en el 14 %, </w:t>
-      </w:r>
-      <w:r>
-        <w:rPr>
-          <w:szCs w:val="20"/>
-          <w:lang w:val="es-US"/>
-        </w:rPr>
-        <w:t>lo que genera</w:t>
-      </w:r>
-      <w:r>
-        <w:rPr>
-          <w:szCs w:val="20"/>
-          <w:lang w:val="es-US"/>
-        </w:rPr>
-        <w:t xml:space="preserve"> unos 11,5 millones de trabajadores de la formalidad y cerca de 2 millones de trabajadores de la informalidad en los mismos períodos. Si bien la variación de un año a otro es mínim</w:t>
-      </w:r>
-      <w:r>
-        <w:rPr>
-          <w:szCs w:val="20"/>
-          <w:lang w:val="es-US"/>
-        </w:rPr>
-        <w:t>a</w:t>
-      </w:r>
-      <w:r>
-        <w:rPr>
-          <w:szCs w:val="20"/>
-          <w:lang w:val="es-US"/>
-        </w:rPr>
-        <w:t>, se constata un ligero emp</w:t>
-      </w:r>
-      <w:r>
-        <w:rPr>
-          <w:szCs w:val="20"/>
-          <w:lang w:val="es-US"/>
-        </w:rPr>
-        <w:t>eora</w:t>
-      </w:r>
-      <w:r>
-        <w:rPr>
-          <w:szCs w:val="20"/>
-          <w:lang w:val="es-US"/>
-        </w:rPr>
-        <w:t xml:space="preserve">miento relativo de las condiciones laborales </w:t>
-      </w:r>
-      <w:r>
-        <w:rPr>
-          <w:szCs w:val="20"/>
-          <w:lang w:val="es-US"/>
-        </w:rPr>
-        <w:t>de las mujere</w:t>
-      </w:r>
-      <w:r>
-        <w:rPr>
-          <w:szCs w:val="20"/>
-          <w:lang w:val="es-US"/>
-        </w:rPr>
-        <w:t>s</w:t>
-      </w:r>
-      <w:r>
-        <w:rPr>
-          <w:szCs w:val="20"/>
-          <w:lang w:val="es-US"/>
-        </w:rPr>
-        <w:t>, puesto que</w:t>
-      </w:r>
-      <w:r>
-        <w:rPr>
-          <w:szCs w:val="20"/>
-          <w:lang w:val="es-US"/>
-        </w:rPr>
-        <w:t xml:space="preserve"> la informalidad de las mujeres es del 17,34% en 2024 y del 18,94% en 2025</w:t>
-      </w:r>
-      <w:r>
-        <w:rPr>
-          <w:szCs w:val="20"/>
-          <w:lang w:val="es-US"/>
-        </w:rPr>
-        <w:t>.</w:t>
-      </w:r>
-      <w:r>
-        <w:rPr>
-          <w:szCs w:val="20"/>
-          <w:lang w:val="es-US"/>
-        </w:rPr>
-        <w:t xml:space="preserve"> </w:t>
-      </w:r>
-      <w:r>
-        <w:rPr>
-          <w:szCs w:val="20"/>
-          <w:lang w:val="es-US"/>
-        </w:rPr>
-        <w:t>E</w:t>
-      </w:r>
-      <w:r>
-        <w:rPr>
-          <w:szCs w:val="20"/>
-          <w:lang w:val="es-US"/>
-        </w:rPr>
-        <w:t>s</w:t>
-      </w:r>
-      <w:r>
-        <w:rPr>
-          <w:szCs w:val="20"/>
-          <w:lang w:val="es-US"/>
-        </w:rPr>
-        <w:t>t</w:t>
-      </w:r>
-      <w:r>
-        <w:rPr>
-          <w:szCs w:val="20"/>
-          <w:lang w:val="es-US"/>
-        </w:rPr>
-        <w:t xml:space="preserve">as tasas son casi el doble que las </w:t>
-      </w:r>
-      <w:r>
-        <w:rPr>
-          <w:szCs w:val="20"/>
-          <w:lang w:val="es-US"/>
-        </w:rPr>
-        <w:t>d</w:t>
-      </w:r>
-      <w:r>
-        <w:rPr>
-          <w:szCs w:val="20"/>
-          <w:lang w:val="es-US"/>
-        </w:rPr>
-        <w:t>e los hombres en los mismos períodos, lo que demuestra que existe una brecha de género en el mercado de trabajo argentino</w:t>
-      </w:r>
-      <w:r>
-        <w:rPr>
-          <w:szCs w:val="20"/>
-          <w:lang w:val="es-US"/>
-        </w:rPr>
-        <w:t>,</w:t>
-      </w:r>
-      <w:r>
-        <w:rPr>
-          <w:szCs w:val="20"/>
-          <w:lang w:val="es-US"/>
-        </w:rPr>
-        <w:t xml:space="preserve"> persistente y estructuralmente relevante en dimensiones como la cantidad de trabajadores.</w:t>
+        <w:t>En cuanto a los cuartos trimestres de 2024 y 2025, la tasa de informalidad de la población ocupada urbana de Argentina está en el 14 %, lo que genera unos 11,5 millones de trabajadores de la formalidad y cerca de 2 millones de trabajadores de la informalidad en los mismos períodos. Si bien la variación de un año a otro es mínima, se constata un ligero empeoramiento relativo de las condiciones laborales de las mujeres, puesto que la informalidad de las mujeres es del 17,34% en 2024 y del 18,94% en 2025. Estas tasas son casi el doble que las de los hombres en los mismos períodos, lo que demuestra que existe una brecha de género en el mercado de trabajo argentino, persistente y estructuralmente relevante en dimensiones como la cantidad de trabajadores.</w:t>
       </w:r>
     </w:p>
     <w:p>
@@ -5205,7 +4916,15 @@
           <w:szCs w:val="20"/>
           <w:lang w:val="es-US"/>
         </w:rPr>
-        <w:t>refleja la realidad de la desigualdad, puesto que a pesar de la difusión de valores inclusivos en las sociedades contemporáneas, el sistema económico ha mantenido cierta esencia excluyente, en la que las mujeres aún enfrentan dificultades para incorporarse plenamente al mercado laboral. Sin embargo, esta estructura inequitativa puede tener un trasfondo antropológico</w:t>
+        <w:t xml:space="preserve">refleja la realidad de la desigualdad, puesto que a pesar de la difusión de valores inclusivos en las sociedades contemporáneas, el sistema económico ha mantenido cierta esencia excluyente, en la que las mujeres aún enfrentan dificultades para </w:t>
+      </w:r>
+      <w:r>
+        <w:rPr>
+          <w:szCs w:val="20"/>
+          <w:lang w:val="es-US"/>
+        </w:rPr>
+        <w:lastRenderedPageBreak/>
+        <w:t>incorporarse plenamente al mercado laboral. Sin embargo, esta estructura inequitativa puede tener un trasfondo antropológico</w:t>
       </w:r>
       <w:r>
         <w:rPr>
@@ -5550,9 +5269,9 @@
           <w:szCs w:val="20"/>
         </w:rPr>
         <w:drawing>
-          <wp:inline distT="0" distB="0" distL="0" distR="0" wp14:anchorId="2A197A39" wp14:editId="49EA86CD">
-            <wp:extent cx="3614029" cy="1766413"/>
-            <wp:effectExtent l="0" t="0" r="0" b="0"/>
+          <wp:inline distT="0" distB="0" distL="0" distR="0" wp14:anchorId="2A197A39" wp14:editId="55945850">
+            <wp:extent cx="3611880" cy="1892104"/>
+            <wp:effectExtent l="0" t="0" r="0" b="635"/>
             <wp:docPr id="1106514598" name="Imagen 1"/>
             <wp:cNvGraphicFramePr>
               <a:graphicFrameLocks xmlns:a="http://schemas.openxmlformats.org/drawingml/2006/main" noChangeAspect="1"/>
@@ -5573,7 +5292,7 @@
                   <pic:spPr>
                     <a:xfrm>
                       <a:off x="0" y="0"/>
-                      <a:ext cx="3880179" cy="1896498"/>
+                      <a:ext cx="3644284" cy="1909079"/>
                     </a:xfrm>
                     <a:prstGeom prst="rect">
                       <a:avLst/>
@@ -5645,24 +5364,102 @@
     </w:p>
     <w:p>
       <w:pPr>
-        <w:rPr>
-          <w:szCs w:val="20"/>
-          <w:lang w:val="es-US"/>
-        </w:rPr>
-      </w:pPr>
-      <w:r>
-        <w:rPr>
-          <w:szCs w:val="20"/>
-          <w:lang w:val="es-US"/>
-        </w:rPr>
-        <w:t xml:space="preserve">La informalidad en el caso de las trabajadoras con hijos e hijas menores de cinco años va del 19,39% en 2024 al 20,79% en 2025; es decir, alcanza niveles superiores </w:t>
-      </w:r>
-      <w:r>
-        <w:rPr>
-          <w:szCs w:val="20"/>
-          <w:lang w:val="es-US"/>
-        </w:rPr>
-        <w:t>a</w:t>
+        <w:spacing w:after="0"/>
+        <w:rPr>
+          <w:szCs w:val="20"/>
+          <w:lang w:val="es-US"/>
+        </w:rPr>
+      </w:pPr>
+      <w:r>
+        <w:rPr>
+          <w:szCs w:val="20"/>
+          <w:lang w:val="es-US"/>
+        </w:rPr>
+        <w:t>La informalidad en el caso de las trabajadoras con hijos e hijas menores de cinco años va del 19,39% en 2024 al 20,79% en 2025; es decir, alcanza niveles superiores a los observados en el conjunto de mujeres ocupadas en esos años. El patrón mencionado sugiere que la convivencia con niños y niñas en edad de precisar cuidados intensivos se asocia con una mayor vulnerabilidad laboral femenina, posiblemente debido a la mayor flexibilidad horaria del trabajo informal. Al contrario, la informalidad entre los trabajadores varones disminuye del 14,30% al 12,80%, lo que aumenta aún más la brecha de género en ese subgrupo y refuerza la idea de que la convivencia con hijos pequeños afecta de manera asimétrica las trayectorias laborales de hombres y mujeres.</w:t>
+      </w:r>
+      <w:r>
+        <w:rPr>
+          <w:szCs w:val="20"/>
+          <w:lang w:val="es-US"/>
+        </w:rPr>
+        <w:t xml:space="preserve"> En este contexto, l</w:t>
+      </w:r>
+      <w:r>
+        <w:rPr>
+          <w:szCs w:val="20"/>
+          <w:lang w:val="es-US"/>
+        </w:rPr>
+        <w:t xml:space="preserve">a particularidad de los hallazgos </w:t>
+      </w:r>
+      <w:r>
+        <w:rPr>
+          <w:szCs w:val="20"/>
+          <w:lang w:val="es-US"/>
+        </w:rPr>
+        <w:t>indica</w:t>
+      </w:r>
+      <w:r>
+        <w:rPr>
+          <w:szCs w:val="20"/>
+          <w:lang w:val="es-US"/>
+        </w:rPr>
+        <w:t xml:space="preserve"> que la </w:t>
+      </w:r>
+      <w:r>
+        <w:rPr>
+          <w:szCs w:val="20"/>
+          <w:lang w:val="es-US"/>
+        </w:rPr>
+        <w:t>pres</w:t>
+      </w:r>
+      <w:r>
+        <w:rPr>
+          <w:szCs w:val="20"/>
+          <w:lang w:val="es-US"/>
+        </w:rPr>
+        <w:t>encia de niños pequeños en el hogar p</w:t>
+      </w:r>
+      <w:r>
+        <w:rPr>
+          <w:szCs w:val="20"/>
+          <w:lang w:val="es-US"/>
+        </w:rPr>
+        <w:t>uede presionar</w:t>
+      </w:r>
+      <w:r>
+        <w:rPr>
+          <w:szCs w:val="20"/>
+          <w:lang w:val="es-US"/>
+        </w:rPr>
+        <w:t xml:space="preserve"> a los hombres </w:t>
+      </w:r>
+      <w:r>
+        <w:rPr>
+          <w:szCs w:val="20"/>
+          <w:lang w:val="es-US"/>
+        </w:rPr>
+        <w:t>haci</w:t>
+      </w:r>
+      <w:r>
+        <w:rPr>
+          <w:szCs w:val="20"/>
+          <w:lang w:val="es-US"/>
+        </w:rPr>
+        <w:t xml:space="preserve">a una movilidad ascendente en el </w:t>
+      </w:r>
+      <w:r>
+        <w:rPr>
+          <w:szCs w:val="20"/>
+          <w:lang w:val="es-US"/>
+        </w:rPr>
+        <w:t>ámbi</w:t>
+      </w:r>
+      <w:r>
+        <w:rPr>
+          <w:szCs w:val="20"/>
+          <w:lang w:val="es-US"/>
+        </w:rPr>
+        <w:t>to laboral, mientras que las mujeres experimentan una presión hacia una movilidad descendente.</w:t>
       </w:r>
       <w:r>
         <w:rPr>
@@ -5676,191 +5473,14 @@
           <w:szCs w:val="20"/>
           <w:lang w:val="es-US"/>
         </w:rPr>
-        <w:t>los observados</w:t>
-      </w:r>
-      <w:r>
-        <w:rPr>
-          <w:szCs w:val="20"/>
-          <w:lang w:val="es-US"/>
-        </w:rPr>
-        <w:t xml:space="preserve"> </w:t>
-      </w:r>
-      <w:r>
-        <w:rPr>
-          <w:szCs w:val="20"/>
-          <w:lang w:val="es-US"/>
-        </w:rPr>
-        <w:t>en</w:t>
-      </w:r>
-      <w:r>
-        <w:rPr>
-          <w:szCs w:val="20"/>
-          <w:lang w:val="es-US"/>
-        </w:rPr>
-        <w:t xml:space="preserve"> el conjunto de mujeres ocupadas en esos años. El patrón mencionado sugiere que la convivencia con niños y niñas en edad de precisar cuidados intensivos se asocia con una mayor vulnerabilidad laboral femenina, posiblemente debido a la mayor flexibilidad horaria del trabajo informal. Al contrario, la informalidad en</w:t>
-      </w:r>
-      <w:r>
-        <w:rPr>
-          <w:szCs w:val="20"/>
-          <w:lang w:val="es-US"/>
-        </w:rPr>
-        <w:t>tre</w:t>
-      </w:r>
-      <w:r>
-        <w:rPr>
-          <w:szCs w:val="20"/>
-          <w:lang w:val="es-US"/>
-        </w:rPr>
-        <w:t xml:space="preserve"> l</w:t>
-      </w:r>
-      <w:r>
-        <w:rPr>
-          <w:szCs w:val="20"/>
-          <w:lang w:val="es-US"/>
-        </w:rPr>
-        <w:t>o</w:t>
-      </w:r>
-      <w:r>
-        <w:rPr>
-          <w:szCs w:val="20"/>
-          <w:lang w:val="es-US"/>
-        </w:rPr>
-        <w:t xml:space="preserve">s trabajadores varones </w:t>
-      </w:r>
-      <w:r>
-        <w:rPr>
-          <w:szCs w:val="20"/>
-          <w:lang w:val="es-US"/>
-        </w:rPr>
-        <w:t>disminuye</w:t>
-      </w:r>
-      <w:r>
-        <w:rPr>
-          <w:szCs w:val="20"/>
-          <w:lang w:val="es-US"/>
-        </w:rPr>
-        <w:t xml:space="preserve"> del 14,30% al 12,80%, </w:t>
-      </w:r>
-      <w:r>
-        <w:rPr>
-          <w:szCs w:val="20"/>
-          <w:lang w:val="es-US"/>
-        </w:rPr>
-        <w:t>lo que aumenta</w:t>
-      </w:r>
-      <w:r>
-        <w:rPr>
-          <w:szCs w:val="20"/>
-          <w:lang w:val="es-US"/>
-        </w:rPr>
-        <w:t xml:space="preserve"> aún más la brecha de género en ese subgrupo y ref</w:t>
-      </w:r>
-      <w:r>
-        <w:rPr>
-          <w:szCs w:val="20"/>
-          <w:lang w:val="es-US"/>
-        </w:rPr>
-        <w:t>uerza</w:t>
-      </w:r>
-      <w:r>
-        <w:rPr>
-          <w:szCs w:val="20"/>
-          <w:lang w:val="es-US"/>
-        </w:rPr>
-        <w:t xml:space="preserve"> la idea de que la convivencia con hijos pequeños afecta de manera asimétrica las trayectorias laborales de hombres y mujeres.</w:t>
-      </w:r>
-    </w:p>
-    <w:p>
-      <w:pPr>
-        <w:spacing w:after="0"/>
-        <w:rPr>
-          <w:szCs w:val="20"/>
-          <w:lang w:val="es-US"/>
-        </w:rPr>
-      </w:pPr>
-      <w:r>
-        <w:rPr>
-          <w:szCs w:val="20"/>
-          <w:lang w:val="es-US"/>
-        </w:rPr>
-        <w:t xml:space="preserve">La particularidad de los hallazgos </w:t>
-      </w:r>
-      <w:r>
-        <w:rPr>
-          <w:szCs w:val="20"/>
-          <w:lang w:val="es-US"/>
-        </w:rPr>
-        <w:t>indica</w:t>
-      </w:r>
-      <w:r>
-        <w:rPr>
-          <w:szCs w:val="20"/>
-          <w:lang w:val="es-US"/>
-        </w:rPr>
-        <w:t xml:space="preserve"> que la </w:t>
-      </w:r>
-      <w:r>
-        <w:rPr>
-          <w:szCs w:val="20"/>
-          <w:lang w:val="es-US"/>
-        </w:rPr>
-        <w:t>pres</w:t>
-      </w:r>
-      <w:r>
-        <w:rPr>
-          <w:szCs w:val="20"/>
-          <w:lang w:val="es-US"/>
-        </w:rPr>
-        <w:t>encia de niños pequeños en el hogar p</w:t>
-      </w:r>
-      <w:r>
-        <w:rPr>
-          <w:szCs w:val="20"/>
-          <w:lang w:val="es-US"/>
-        </w:rPr>
-        <w:t>uede presionar</w:t>
-      </w:r>
-      <w:r>
-        <w:rPr>
-          <w:szCs w:val="20"/>
-          <w:lang w:val="es-US"/>
-        </w:rPr>
-        <w:t xml:space="preserve"> a los hombres </w:t>
-      </w:r>
-      <w:r>
-        <w:rPr>
-          <w:szCs w:val="20"/>
-          <w:lang w:val="es-US"/>
-        </w:rPr>
-        <w:t>haci</w:t>
-      </w:r>
-      <w:r>
-        <w:rPr>
-          <w:szCs w:val="20"/>
-          <w:lang w:val="es-US"/>
-        </w:rPr>
-        <w:t xml:space="preserve">a una movilidad ascendente en el </w:t>
-      </w:r>
-      <w:r>
-        <w:rPr>
-          <w:szCs w:val="20"/>
-          <w:lang w:val="es-US"/>
-        </w:rPr>
-        <w:t>ámbi</w:t>
-      </w:r>
-      <w:r>
-        <w:rPr>
-          <w:szCs w:val="20"/>
-          <w:lang w:val="es-US"/>
-        </w:rPr>
-        <w:t>to laboral, mientras que las mujeres experimentan una presión hacia una movilidad descendente.</w:t>
-      </w:r>
-      <w:r>
-        <w:rPr>
-          <w:szCs w:val="20"/>
-          <w:lang w:val="es-US"/>
-        </w:rPr>
-        <w:t xml:space="preserve"> Si bien es imperativo y pertinente diseñar un análisis de orden causal para argumentar dicha correspondencia, la información descriptiva </w:t>
+        <w:t>Esta</w:t>
+      </w:r>
+      <w:r>
+        <w:rPr>
+          <w:szCs w:val="20"/>
+          <w:lang w:val="es-US"/>
+        </w:rPr>
+        <w:t xml:space="preserve"> información descriptiva </w:t>
       </w:r>
       <w:r>
         <w:rPr>
@@ -5918,7 +5538,6 @@
         <w:rPr>
           <w:szCs w:val="20"/>
         </w:rPr>
-        <w:lastRenderedPageBreak/>
         <w:t xml:space="preserve">Figura </w:t>
       </w:r>
       <w:r>
@@ -6051,14 +5670,15 @@
       </w:pPr>
       <w:r>
         <w:rPr>
+          <w:noProof/>
           <w:sz w:val="20"/>
           <w:szCs w:val="20"/>
           <w:lang w:val="es-US"/>
         </w:rPr>
         <w:drawing>
-          <wp:inline distT="0" distB="0" distL="0" distR="0" wp14:anchorId="3C4D2A46" wp14:editId="45E44147">
-            <wp:extent cx="3719700" cy="1969476"/>
-            <wp:effectExtent l="0" t="0" r="1905" b="0"/>
+          <wp:inline distT="0" distB="0" distL="0" distR="0" wp14:anchorId="3C4D2A46" wp14:editId="49E68887">
+            <wp:extent cx="4285679" cy="1835834"/>
+            <wp:effectExtent l="0" t="0" r="0" b="5715"/>
             <wp:docPr id="293491581" name="Imagen 1"/>
             <wp:cNvGraphicFramePr>
               <a:graphicFrameLocks xmlns:a="http://schemas.openxmlformats.org/drawingml/2006/main" noChangeAspect="1"/>
@@ -6079,7 +5699,7 @@
                   <pic:spPr>
                     <a:xfrm>
                       <a:off x="0" y="0"/>
-                      <a:ext cx="3938265" cy="2085200"/>
+                      <a:ext cx="4433232" cy="1899041"/>
                     </a:xfrm>
                     <a:prstGeom prst="rect">
                       <a:avLst/>
@@ -6167,63 +5787,8 @@
           <w:szCs w:val="20"/>
           <w:lang w:val="es-US"/>
         </w:rPr>
-        <w:t xml:space="preserve">La figura 4 </w:t>
-      </w:r>
-      <w:r>
-        <w:rPr>
-          <w:szCs w:val="20"/>
-          <w:lang w:val="es-US"/>
-        </w:rPr>
-        <w:t>muestra</w:t>
-      </w:r>
-      <w:r>
-        <w:rPr>
-          <w:szCs w:val="20"/>
-          <w:lang w:val="es-US"/>
-        </w:rPr>
-        <w:t xml:space="preserve"> la distribución del ingreso correspondiente a la ocupación principal y del ingreso total individual para cada una de las condiciones laborales, </w:t>
-      </w:r>
-      <w:r>
-        <w:rPr>
-          <w:szCs w:val="20"/>
-          <w:lang w:val="es-US"/>
-        </w:rPr>
-        <w:t>con</w:t>
-      </w:r>
-      <w:r>
-        <w:rPr>
-          <w:szCs w:val="20"/>
-          <w:lang w:val="es-US"/>
-        </w:rPr>
-        <w:t xml:space="preserve"> los ejes en escala logarítmica natural. En ambos paneles superiores, la distribución de los trabajadores informales avanza </w:t>
-      </w:r>
-      <w:r>
-        <w:rPr>
-          <w:szCs w:val="20"/>
-          <w:lang w:val="es-US"/>
-        </w:rPr>
-        <w:t>sistemáticamente</w:t>
-      </w:r>
-      <w:r>
-        <w:rPr>
-          <w:szCs w:val="20"/>
-          <w:lang w:val="es-US"/>
-        </w:rPr>
-        <w:t xml:space="preserve"> hacia la izquierda de la de los formales, </w:t>
-      </w:r>
-      <w:r>
-        <w:rPr>
-          <w:szCs w:val="20"/>
-          <w:lang w:val="es-US"/>
-        </w:rPr>
-        <w:t>lo que evidencia</w:t>
-      </w:r>
-      <w:r>
-        <w:rPr>
-          <w:szCs w:val="20"/>
-          <w:lang w:val="es-US"/>
-        </w:rPr>
-        <w:t xml:space="preserve"> una diferencia en términos de ingresos consistente con lo registrado por </w:t>
+        <w:lastRenderedPageBreak/>
+        <w:t xml:space="preserve">La figura 4 muestra la distribución del ingreso correspondiente a la ocupación principal y del ingreso total individual para cada una de las condiciones laborales, con los ejes en escala logarítmica natural. En ambos paneles superiores, la distribución de los trabajadores informales avanza sistemáticamente hacia la izquierda de la de los formales, lo que evidencia una diferencia en términos de ingresos consistente con lo registrado por </w:t>
       </w:r>
       <w:sdt>
         <w:sdtPr>
@@ -6256,21 +5821,7 @@
           <w:szCs w:val="20"/>
           <w:lang w:val="es-US"/>
         </w:rPr>
-        <w:t xml:space="preserve"> </w:t>
-      </w:r>
-      <w:r>
-        <w:rPr>
-          <w:szCs w:val="20"/>
-          <w:lang w:val="es-US"/>
-        </w:rPr>
-        <w:t>en</w:t>
-      </w:r>
-      <w:r>
-        <w:rPr>
-          <w:szCs w:val="20"/>
-          <w:lang w:val="es-US"/>
-        </w:rPr>
-        <w:t xml:space="preserve"> el contexto latinoamericano. La distribución </w:t>
+        <w:t xml:space="preserve"> en el contexto latinoamericano. La distribución </w:t>
       </w:r>
       <w:proofErr w:type="spellStart"/>
       <w:r>
@@ -6286,21 +5837,7 @@
           <w:szCs w:val="20"/>
           <w:lang w:val="es-US"/>
         </w:rPr>
-        <w:t xml:space="preserve"> del ingreso principal permite visualizar mejor esta separación: la curva del ingreso informal muestra un pico más abrupto y concentrado en valores menores</w:t>
-      </w:r>
-      <w:r>
-        <w:rPr>
-          <w:szCs w:val="20"/>
-          <w:lang w:val="es-US"/>
-        </w:rPr>
-        <w:t>,</w:t>
-      </w:r>
-      <w:r>
-        <w:rPr>
-          <w:szCs w:val="20"/>
-          <w:lang w:val="es-US"/>
-        </w:rPr>
-        <w:t xml:space="preserve"> mientras que la del ingreso formal presenta una distribución más aplanada, desplazada hacia la derecha, lo </w:t>
+        <w:t xml:space="preserve"> del ingreso principal permite visualizar mejor esta separación: la curva del ingreso informal muestra un pico más abrupto y concentrado en valores menores, mientras que la del ingreso formal presenta una distribución más aplanada, desplazada hacia la derecha, lo </w:t>
       </w:r>
       <w:r>
         <w:rPr>
@@ -6329,21 +5866,7 @@
           <w:szCs w:val="20"/>
           <w:lang w:val="es-US"/>
         </w:rPr>
-        <w:t xml:space="preserve">Los paneles inferiores, que se refieren a la misma variable de ingreso total individual, presentan un patrón similar, pero con una separación de grupos algo más acentuada, lo que podría ser indicativo de un acceso más elevado a fuentes de ingreso complementarias a la ocupación principal por parte de los trabajadores formales. Este patrón de los grupos de ingreso </w:t>
-      </w:r>
-      <w:r>
-        <w:rPr>
-          <w:szCs w:val="20"/>
-          <w:lang w:val="es-US"/>
-        </w:rPr>
-        <w:t>respalda</w:t>
-      </w:r>
-      <w:r>
-        <w:rPr>
-          <w:szCs w:val="20"/>
-          <w:lang w:val="es-US"/>
-        </w:rPr>
-        <w:t xml:space="preserve"> la expectativa </w:t>
+        <w:t xml:space="preserve">Los paneles inferiores, que se refieren a la misma variable de ingreso total individual, presentan un patrón similar, pero con una separación de grupos algo más acentuada, lo que podría ser indicativo de un acceso más elevado a fuentes de ingreso complementarias a la ocupación principal por parte de los trabajadores formales. Este patrón de los grupos de ingreso respalda la expectativa </w:t>
       </w:r>
       <w:r>
         <w:rPr>
@@ -6357,35 +5880,7 @@
           <w:szCs w:val="20"/>
           <w:lang w:val="es-US"/>
         </w:rPr>
-        <w:t xml:space="preserve"> en el análisis anterior acerca de la presión diferencial que ejerce la informalidad sobre la variable de ingreso de di</w:t>
-      </w:r>
-      <w:r>
-        <w:rPr>
-          <w:szCs w:val="20"/>
-          <w:lang w:val="es-US"/>
-        </w:rPr>
-        <w:t>stinto</w:t>
-      </w:r>
-      <w:r>
-        <w:rPr>
-          <w:szCs w:val="20"/>
-          <w:lang w:val="es-US"/>
-        </w:rPr>
-        <w:t xml:space="preserve">s grupos de </w:t>
-      </w:r>
-      <w:r>
-        <w:rPr>
-          <w:szCs w:val="20"/>
-          <w:lang w:val="es-US"/>
-        </w:rPr>
-        <w:t xml:space="preserve">la </w:t>
-      </w:r>
-      <w:r>
-        <w:rPr>
-          <w:szCs w:val="20"/>
-          <w:lang w:val="es-US"/>
-        </w:rPr>
-        <w:t>población.</w:t>
+        <w:t xml:space="preserve"> en el análisis anterior acerca de la presión diferencial que ejerce la informalidad sobre la variable de ingreso de distintos grupos de la población.</w:t>
       </w:r>
     </w:p>
     <w:p>
@@ -6435,31 +5930,7 @@
         <w:rPr>
           <w:szCs w:val="20"/>
         </w:rPr>
-        <w:t xml:space="preserve"> que se van utilizando a lo largo del desarrollo, y que se refiere a un apéndice. </w:t>
-      </w:r>
-      <w:r>
-        <w:rPr>
-          <w:szCs w:val="20"/>
-        </w:rPr>
-        <w:t>F</w:t>
-      </w:r>
-      <w:r>
-        <w:rPr>
-          <w:szCs w:val="20"/>
-        </w:rPr>
-        <w:t xml:space="preserve">inalmente, se valora el tiempo total dedicado a este trabajo, teniendo en cuenta las dificultades de la primera entrega, que se asocian principalmente a un aprendizaje lento </w:t>
-      </w:r>
-      <w:r>
-        <w:rPr>
-          <w:szCs w:val="20"/>
-        </w:rPr>
-        <w:t>al</w:t>
-      </w:r>
-      <w:r>
-        <w:rPr>
-          <w:szCs w:val="20"/>
-        </w:rPr>
-        <w:t xml:space="preserve"> adaptarse a nuevas herramientas de trabajo colaborativo.</w:t>
+        <w:t xml:space="preserve"> que se van utilizando a lo largo del desarrollo, y que se refiere a un apéndice. Finalmente, se valora el tiempo total dedicado a este trabajo, teniendo en cuenta las dificultades de la primera entrega, que se asocian principalmente a un aprendizaje lento al adaptarse a nuevas herramientas de trabajo colaborativo.</w:t>
       </w:r>
     </w:p>
     <w:p>
@@ -6506,21 +5977,7 @@
           <w:szCs w:val="20"/>
           <w:lang w:val="es-US"/>
         </w:rPr>
-        <w:t xml:space="preserve">La colaboración de la inteligencia artificial tuvo </w:t>
-      </w:r>
-      <w:r>
-        <w:rPr>
-          <w:szCs w:val="20"/>
-          <w:lang w:val="es-US"/>
-        </w:rPr>
-        <w:t>como</w:t>
-      </w:r>
-      <w:r>
-        <w:rPr>
-          <w:szCs w:val="20"/>
-          <w:lang w:val="es-US"/>
-        </w:rPr>
-        <w:t xml:space="preserve"> objetivo principal </w:t>
+        <w:t xml:space="preserve">La colaboración de la inteligencia artificial tuvo como objetivo principal </w:t>
       </w:r>
       <w:r>
         <w:rPr>
@@ -6590,203 +6047,7 @@
           <w:szCs w:val="20"/>
           <w:lang w:val="es-US"/>
         </w:rPr>
-        <w:t xml:space="preserve"> el análisis. Se colaboró con la inteligencia artificial para contrastar los niveles y tipos de las variables seleccionadas </w:t>
-      </w:r>
-      <w:r>
-        <w:rPr>
-          <w:szCs w:val="20"/>
-          <w:lang w:val="es-US"/>
-        </w:rPr>
-        <w:t>con</w:t>
-      </w:r>
-      <w:r>
-        <w:rPr>
-          <w:szCs w:val="20"/>
-          <w:lang w:val="es-US"/>
-        </w:rPr>
-        <w:t xml:space="preserve"> los diccionarios oficiales</w:t>
-      </w:r>
-      <w:r>
-        <w:rPr>
-          <w:szCs w:val="20"/>
-          <w:lang w:val="es-US"/>
-        </w:rPr>
-        <w:t>.</w:t>
-      </w:r>
-      <w:r>
-        <w:rPr>
-          <w:szCs w:val="20"/>
-          <w:lang w:val="es-US"/>
-        </w:rPr>
-        <w:t xml:space="preserve"> </w:t>
-      </w:r>
-      <w:r>
-        <w:rPr>
-          <w:szCs w:val="20"/>
-          <w:lang w:val="es-US"/>
-        </w:rPr>
-        <w:t>El proceso se apoyó en la inteligencia artificial (IA)</w:t>
-      </w:r>
-      <w:r>
-        <w:rPr>
-          <w:szCs w:val="20"/>
-          <w:lang w:val="es-US"/>
-        </w:rPr>
-        <w:t xml:space="preserve"> para construir las bases de datos derivadas de la condición de actividad </w:t>
-      </w:r>
-      <w:r>
-        <w:rPr>
-          <w:szCs w:val="20"/>
-          <w:lang w:val="es-US"/>
-        </w:rPr>
-        <w:t>y</w:t>
-      </w:r>
-      <w:r>
-        <w:rPr>
-          <w:szCs w:val="20"/>
-          <w:lang w:val="es-US"/>
-        </w:rPr>
-        <w:t xml:space="preserve"> generar variables dicotómicas </w:t>
-      </w:r>
-      <w:r>
-        <w:rPr>
-          <w:szCs w:val="20"/>
-          <w:lang w:val="es-US"/>
-        </w:rPr>
-        <w:t>según</w:t>
-      </w:r>
-      <w:r>
-        <w:rPr>
-          <w:szCs w:val="20"/>
-          <w:lang w:val="es-US"/>
-        </w:rPr>
-        <w:t xml:space="preserve"> criterios de codificación </w:t>
-      </w:r>
-      <w:r>
-        <w:rPr>
-          <w:szCs w:val="20"/>
-          <w:lang w:val="es-US"/>
-        </w:rPr>
-        <w:t>estableci</w:t>
-      </w:r>
-      <w:r>
-        <w:rPr>
-          <w:szCs w:val="20"/>
-          <w:lang w:val="es-US"/>
-        </w:rPr>
-        <w:t>dos</w:t>
-      </w:r>
-      <w:r>
-        <w:rPr>
-          <w:szCs w:val="20"/>
-          <w:lang w:val="es-US"/>
-        </w:rPr>
-        <w:t>.</w:t>
-      </w:r>
-      <w:r>
-        <w:rPr>
-          <w:szCs w:val="20"/>
-          <w:lang w:val="es-US"/>
-        </w:rPr>
-        <w:t xml:space="preserve"> </w:t>
-      </w:r>
-      <w:r>
-        <w:rPr>
-          <w:szCs w:val="20"/>
-          <w:lang w:val="es-US"/>
-        </w:rPr>
-        <w:t>S</w:t>
-      </w:r>
-      <w:r>
-        <w:rPr>
-          <w:szCs w:val="20"/>
-          <w:lang w:val="es-US"/>
-        </w:rPr>
-        <w:t xml:space="preserve">e </w:t>
-      </w:r>
-      <w:r>
-        <w:rPr>
-          <w:szCs w:val="20"/>
-          <w:lang w:val="es-US"/>
-        </w:rPr>
-        <w:t>utilizó también el soporte de la IA</w:t>
-      </w:r>
-      <w:r>
-        <w:rPr>
-          <w:szCs w:val="20"/>
-          <w:lang w:val="es-US"/>
-        </w:rPr>
-        <w:t xml:space="preserve"> para el renombramiento de variables </w:t>
-      </w:r>
-      <w:r>
-        <w:rPr>
-          <w:szCs w:val="20"/>
-          <w:lang w:val="es-US"/>
-        </w:rPr>
-        <w:t>conforme a</w:t>
-      </w:r>
-      <w:r>
-        <w:rPr>
-          <w:szCs w:val="20"/>
-          <w:lang w:val="es-US"/>
-        </w:rPr>
-        <w:t xml:space="preserve"> las pautas estándar; se solicitó ayuda para ajustar los ingresos por inflación entre períodos </w:t>
-      </w:r>
-      <w:r>
-        <w:rPr>
-          <w:szCs w:val="20"/>
-          <w:lang w:val="es-US"/>
-        </w:rPr>
-        <w:t>y</w:t>
-      </w:r>
-      <w:r>
-        <w:rPr>
-          <w:szCs w:val="20"/>
-          <w:lang w:val="es-US"/>
-        </w:rPr>
-        <w:t xml:space="preserve"> para elaborar herramientas descriptivas, como tablas de frecuencia y matrices de correlación, con variables </w:t>
-      </w:r>
-      <w:r>
-        <w:rPr>
-          <w:szCs w:val="20"/>
-          <w:lang w:val="es-US"/>
-        </w:rPr>
-        <w:t>continuas</w:t>
-      </w:r>
-      <w:r>
-        <w:rPr>
-          <w:szCs w:val="20"/>
-          <w:lang w:val="es-US"/>
-        </w:rPr>
-        <w:t xml:space="preserve"> o categóricas. Esta colaboración </w:t>
-      </w:r>
-      <w:r>
-        <w:rPr>
-          <w:szCs w:val="20"/>
-          <w:lang w:val="es-US"/>
-        </w:rPr>
-        <w:t>permitió</w:t>
-      </w:r>
-      <w:r>
-        <w:rPr>
-          <w:szCs w:val="20"/>
-          <w:lang w:val="es-US"/>
-        </w:rPr>
-        <w:t xml:space="preserve"> </w:t>
-      </w:r>
-      <w:r>
-        <w:rPr>
-          <w:szCs w:val="20"/>
-          <w:lang w:val="es-US"/>
-        </w:rPr>
-        <w:t>estruct</w:t>
-      </w:r>
-      <w:r>
-        <w:rPr>
-          <w:szCs w:val="20"/>
-          <w:lang w:val="es-US"/>
-        </w:rPr>
-        <w:t>urar la preparación de la base analítica en un marco ordenado y transparente.</w:t>
+        <w:t xml:space="preserve"> el análisis. Se colaboró con la inteligencia artificial para contrastar los niveles y tipos de las variables seleccionadas con los diccionarios oficiales. El proceso se apoyó en la inteligencia artificial (IA) para construir las bases de datos derivadas de la condición de actividad y generar variables dicotómicas según criterios de codificación establecidos. Se utilizó también el soporte de la IA para el renombramiento de variables conforme a las pautas estándar; se solicitó ayuda para ajustar los ingresos por inflación entre períodos y para elaborar herramientas descriptivas, como tablas de frecuencia y matrices de correlación, con variables continuas o categóricas. Esta colaboración permitió estructurar la preparación de la base analítica en un marco ordenado y transparente.</w:t>
       </w:r>
     </w:p>
     <w:p>
@@ -6802,7 +6063,6 @@
           <w:szCs w:val="20"/>
           <w:lang w:val="es-US"/>
         </w:rPr>
-        <w:lastRenderedPageBreak/>
         <w:t>Tiempo estimado</w:t>
       </w:r>
     </w:p>
@@ -6810,7 +6070,6 @@
       <w:pPr>
         <w:rPr>
           <w:szCs w:val="20"/>
-          <w:lang w:val="es-US"/>
         </w:rPr>
       </w:pPr>
       <w:r>
@@ -6865,31 +6124,7 @@
         <w:rPr>
           <w:szCs w:val="20"/>
         </w:rPr>
-        <w:t>e 12 horas. Se espera que este tiempo se reduzca en los próximos entregables, considerando</w:t>
-      </w:r>
-      <w:r>
-        <w:rPr>
-          <w:szCs w:val="20"/>
-        </w:rPr>
-        <w:t>,</w:t>
-      </w:r>
-      <w:r>
-        <w:rPr>
-          <w:szCs w:val="20"/>
-        </w:rPr>
-        <w:t xml:space="preserve"> además</w:t>
-      </w:r>
-      <w:r>
-        <w:rPr>
-          <w:szCs w:val="20"/>
-        </w:rPr>
-        <w:t>,</w:t>
-      </w:r>
-      <w:r>
-        <w:rPr>
-          <w:szCs w:val="20"/>
-        </w:rPr>
-        <w:t xml:space="preserve"> el escaso margen temporal entre ellos</w:t>
+        <w:t>e 12 horas. Se espera que este tiempo se reduzca en los próximos entregables, considerando además el escaso margen temporal entre ellos</w:t>
       </w:r>
       <w:r>
         <w:rPr>
@@ -6906,6 +6141,21 @@
     </w:p>
     <w:p>
       <w:pPr>
+        <w:spacing w:line="259" w:lineRule="auto"/>
+        <w:jc w:val="left"/>
+        <w:rPr>
+          <w:szCs w:val="20"/>
+        </w:rPr>
+      </w:pPr>
+      <w:r>
+        <w:rPr>
+          <w:szCs w:val="20"/>
+        </w:rPr>
+        <w:br w:type="page"/>
+      </w:r>
+    </w:p>
+    <w:p>
+      <w:pPr>
         <w:pStyle w:val="Ttulo1"/>
         <w:rPr>
           <w:szCs w:val="20"/>
@@ -6917,6 +6167,7 @@
           <w:szCs w:val="20"/>
           <w:lang w:val="es-US"/>
         </w:rPr>
+        <w:lastRenderedPageBreak/>
         <w:t>Referencias</w:t>
       </w:r>
     </w:p>
@@ -14462,6 +13713,7 @@
   <w:style w:type="character" w:default="1" w:styleId="Fuentedeprrafopredeter">
     <w:name w:val="Default Paragraph Font"/>
     <w:uiPriority w:val="1"/>
+    <w:semiHidden/>
     <w:unhideWhenUsed/>
   </w:style>
   <w:style w:type="table" w:default="1" w:styleId="Tablanormal">
@@ -15574,7 +14826,7 @@
     </w:docPart>
     <w:docPart>
       <w:docPartPr>
-        <w:name w:val="01B83E5E14260C4898E3FC02EE44A5EC"/>
+        <w:name w:val="6796B5EBE6279F48AA0BC0D6F950B8E2"/>
         <w:category>
           <w:name w:val="General"/>
           <w:gallery w:val="placeholder"/>
@@ -15585,12 +14837,12 @@
         <w:behaviors>
           <w:behavior w:val="content"/>
         </w:behaviors>
-        <w:guid w:val="{55B9D4E9-D60A-B041-9933-5C33B6037639}"/>
+        <w:guid w:val="{B89B22F7-3682-A14E-A053-B2344856ED81}"/>
       </w:docPartPr>
       <w:docPartBody>
         <w:p>
           <w:pPr>
-            <w:pStyle w:val="01B83E5E14260C4898E3FC02EE44A5EC"/>
+            <w:pStyle w:val="6796B5EBE6279F48AA0BC0D6F950B8E2"/>
           </w:pPr>
           <w:r>
             <w:rPr>
@@ -15719,7 +14971,10 @@
     <w:rsid w:val="004C7FDE"/>
     <w:rsid w:val="005A5BEE"/>
     <w:rsid w:val="006D29C6"/>
+    <w:rsid w:val="00A2183C"/>
     <w:rsid w:val="00AC13E3"/>
+    <w:rsid w:val="00AF2C96"/>
+    <w:rsid w:val="00BE0F6A"/>
     <w:rsid w:val="00DA4981"/>
     <w:rsid w:val="00E36221"/>
     <w:rsid w:val="00E877D6"/>
@@ -16179,7 +15434,7 @@
     <w:basedOn w:val="Fuentedeprrafopredeter"/>
     <w:uiPriority w:val="99"/>
     <w:semiHidden/>
-    <w:rsid w:val="00E36221"/>
+    <w:rsid w:val="00AF2C96"/>
     <w:rPr>
       <w:color w:val="666666"/>
     </w:rPr>
@@ -16192,21 +15447,9 @@
     <w:name w:val="F6998C41F6C94C4FA289D350D2806EE8"/>
     <w:rsid w:val="00046A96"/>
   </w:style>
-  <w:style w:type="paragraph" w:customStyle="1" w:styleId="326DC2F8A87C4045A41E8D110D802F18">
-    <w:name w:val="326DC2F8A87C4045A41E8D110D802F18"/>
-    <w:rsid w:val="00E36221"/>
-  </w:style>
-  <w:style w:type="paragraph" w:customStyle="1" w:styleId="7C1723BED57AF148955422613946CCD6">
-    <w:name w:val="7C1723BED57AF148955422613946CCD6"/>
-    <w:rsid w:val="00046A96"/>
-  </w:style>
-  <w:style w:type="paragraph" w:customStyle="1" w:styleId="341A780BD68A5849AC53C8BE6C9C7D4B">
-    <w:name w:val="341A780BD68A5849AC53C8BE6C9C7D4B"/>
-    <w:rsid w:val="00046A96"/>
-  </w:style>
-  <w:style w:type="paragraph" w:customStyle="1" w:styleId="566F60A7D875334BAAFBDC6AA1D099D5">
-    <w:name w:val="566F60A7D875334BAAFBDC6AA1D099D5"/>
-    <w:rsid w:val="00046A96"/>
+  <w:style w:type="paragraph" w:customStyle="1" w:styleId="6796B5EBE6279F48AA0BC0D6F950B8E2">
+    <w:name w:val="6796B5EBE6279F48AA0BC0D6F950B8E2"/>
+    <w:rsid w:val="00AF2C96"/>
   </w:style>
   <w:style w:type="paragraph" w:customStyle="1" w:styleId="8463F3F54C6DD042BBB903E9E8FF24C4">
     <w:name w:val="8463F3F54C6DD042BBB903E9E8FF24C4"/>
@@ -16613,6 +15856,15 @@
 </file>
 
 <file path=customXml/item1.xml><?xml version="1.0" encoding="utf-8"?>
+<p:properties xmlns:p="http://schemas.microsoft.com/office/2006/metadata/properties" xmlns:xsi="http://www.w3.org/2001/XMLSchema-instance" xmlns:pc="http://schemas.microsoft.com/office/infopath/2007/PartnerControls">
+  <documentManagement>
+    <Nro xmlns="e62bc30b-b884-4ee1-b0ab-e2e35dfacfd5">0</Nro>
+    <Unidad xmlns="e62bc30b-b884-4ee1-b0ab-e2e35dfacfd5" xsi:nil="true"/>
+  </documentManagement>
+</p:properties>
+</file>
+
+<file path=customXml/item2.xml><?xml version="1.0" encoding="utf-8"?>
 <ct:contentTypeSchema xmlns:ct="http://schemas.microsoft.com/office/2006/metadata/contentType" xmlns:ma="http://schemas.microsoft.com/office/2006/metadata/properties/metaAttributes" ct:_="" ma:_="" ma:contentTypeName="Documento" ma:contentTypeID="0x01010006ACA7DB3593B24E887290A71F51A18F" ma:contentTypeVersion="10" ma:contentTypeDescription="Crear nuevo documento." ma:contentTypeScope="" ma:versionID="5fde8b866a40f115df17144418c3774a">
   <xsd:schema xmlns:xsd="http://www.w3.org/2001/XMLSchema" xmlns:xs="http://www.w3.org/2001/XMLSchema" xmlns:p="http://schemas.microsoft.com/office/2006/metadata/properties" xmlns:ns2="e62bc30b-b884-4ee1-b0ab-e2e35dfacfd5" targetNamespace="http://schemas.microsoft.com/office/2006/metadata/properties" ma:root="true" ma:fieldsID="722d0d74b5f1a0e9a135ab2398c17b72" ns2:_="">
     <xsd:import namespace="e62bc30b-b884-4ee1-b0ab-e2e35dfacfd5"/>
@@ -16792,16 +16044,11 @@
 </ct:contentTypeSchema>
 </file>
 
-<file path=customXml/item2.xml><?xml version="1.0" encoding="utf-8"?>
-<p:properties xmlns:p="http://schemas.microsoft.com/office/2006/metadata/properties" xmlns:xsi="http://www.w3.org/2001/XMLSchema-instance" xmlns:pc="http://schemas.microsoft.com/office/infopath/2007/PartnerControls">
-  <documentManagement>
-    <Nro xmlns="e62bc30b-b884-4ee1-b0ab-e2e35dfacfd5">0</Nro>
-    <Unidad xmlns="e62bc30b-b884-4ee1-b0ab-e2e35dfacfd5" xsi:nil="true"/>
-  </documentManagement>
-</p:properties>
+<file path=customXml/item3.xml><?xml version="1.0" encoding="utf-8"?>
+<b:Sources xmlns:b="http://schemas.openxmlformats.org/officeDocument/2006/bibliography" xmlns="http://schemas.openxmlformats.org/officeDocument/2006/bibliography" SelectedStyle="/APASixthEditionOfficeOnline.xsl" StyleName="APA" Version="6"/>
 </file>
 
-<file path=customXml/item3.xml><?xml version="1.0" encoding="utf-8"?>
+<file path=customXml/item4.xml><?xml version="1.0" encoding="utf-8"?>
 <?mso-contentType ?>
 <FormTemplates xmlns="http://schemas.microsoft.com/sharepoint/v3/contenttype/forms">
   <Display>DocumentLibraryForm</Display>
@@ -16810,11 +16057,17 @@
 </FormTemplates>
 </file>
 
-<file path=customXml/item4.xml><?xml version="1.0" encoding="utf-8"?>
-<b:Sources xmlns:b="http://schemas.openxmlformats.org/officeDocument/2006/bibliography" xmlns="http://schemas.openxmlformats.org/officeDocument/2006/bibliography" SelectedStyle="/APASixthEditionOfficeOnline.xsl" StyleName="APA" Version="6"/>
+<file path=customXml/itemProps1.xml><?xml version="1.0" encoding="utf-8"?>
+<ds:datastoreItem xmlns:ds="http://schemas.openxmlformats.org/officeDocument/2006/customXml" ds:itemID="{DAAF528F-7240-408A-9BF0-E37AC9702D32}">
+  <ds:schemaRefs>
+    <ds:schemaRef ds:uri="http://schemas.microsoft.com/office/2006/metadata/properties"/>
+    <ds:schemaRef ds:uri="http://schemas.microsoft.com/office/infopath/2007/PartnerControls"/>
+    <ds:schemaRef ds:uri="e62bc30b-b884-4ee1-b0ab-e2e35dfacfd5"/>
+  </ds:schemaRefs>
+</ds:datastoreItem>
 </file>
 
-<file path=customXml/itemProps1.xml><?xml version="1.0" encoding="utf-8"?>
+<file path=customXml/itemProps2.xml><?xml version="1.0" encoding="utf-8"?>
 <ds:datastoreItem xmlns:ds="http://schemas.openxmlformats.org/officeDocument/2006/customXml" ds:itemID="{BB19413B-A659-4239-B251-6BE967D5DACB}">
   <ds:schemaRefs>
     <ds:schemaRef ds:uri="http://schemas.microsoft.com/office/2006/metadata/contentType"/>
@@ -16832,28 +16085,18 @@
 </ds:datastoreItem>
 </file>
 
-<file path=customXml/itemProps2.xml><?xml version="1.0" encoding="utf-8"?>
-<ds:datastoreItem xmlns:ds="http://schemas.openxmlformats.org/officeDocument/2006/customXml" ds:itemID="{DAAF528F-7240-408A-9BF0-E37AC9702D32}">
+<file path=customXml/itemProps3.xml><?xml version="1.0" encoding="utf-8"?>
+<ds:datastoreItem xmlns:ds="http://schemas.openxmlformats.org/officeDocument/2006/customXml" ds:itemID="{BE0E3CBB-9640-C643-97A5-411B9F838128}">
   <ds:schemaRefs>
-    <ds:schemaRef ds:uri="http://schemas.microsoft.com/office/2006/metadata/properties"/>
-    <ds:schemaRef ds:uri="http://schemas.microsoft.com/office/infopath/2007/PartnerControls"/>
-    <ds:schemaRef ds:uri="e62bc30b-b884-4ee1-b0ab-e2e35dfacfd5"/>
+    <ds:schemaRef ds:uri="http://schemas.openxmlformats.org/officeDocument/2006/bibliography"/>
   </ds:schemaRefs>
 </ds:datastoreItem>
 </file>
 
-<file path=customXml/itemProps3.xml><?xml version="1.0" encoding="utf-8"?>
+<file path=customXml/itemProps4.xml><?xml version="1.0" encoding="utf-8"?>
 <ds:datastoreItem xmlns:ds="http://schemas.openxmlformats.org/officeDocument/2006/customXml" ds:itemID="{7E3075BF-FDAF-4D4D-8DC1-23126609A178}">
   <ds:schemaRefs>
     <ds:schemaRef ds:uri="http://schemas.microsoft.com/sharepoint/v3/contenttype/forms"/>
   </ds:schemaRefs>
 </ds:datastoreItem>
-</file>
-
-<file path=customXml/itemProps4.xml><?xml version="1.0" encoding="utf-8"?>
-<ds:datastoreItem xmlns:ds="http://schemas.openxmlformats.org/officeDocument/2006/customXml" ds:itemID="{BE0E3CBB-9640-C643-97A5-411B9F838128}">
-  <ds:schemaRefs>
-    <ds:schemaRef ds:uri="http://schemas.openxmlformats.org/officeDocument/2006/bibliography"/>
-  </ds:schemaRefs>
-</ds:datastoreItem>
 </file>
</xml_diff>

<commit_message>
Mejora del análisis de kernels
Se realizó un análisis iterativo de todos los posibles kernels para evaluar la distribución de ingresos entre los sectores formal e informal.
</commit_message>
<xml_diff>
--- a/TP1/TP1 Programacion.docx
+++ b/TP1/TP1 Programacion.docx
@@ -5382,14 +5382,14 @@
           <w:szCs w:val="20"/>
           <w:lang w:val="es-US"/>
         </w:rPr>
-        <w:t xml:space="preserve"> En este contexto, l</w:t>
-      </w:r>
-      <w:r>
-        <w:rPr>
-          <w:szCs w:val="20"/>
-          <w:lang w:val="es-US"/>
-        </w:rPr>
-        <w:t xml:space="preserve">a particularidad de los hallazgos </w:t>
+        <w:t xml:space="preserve"> En este contexto, </w:t>
+      </w:r>
+      <w:r>
+        <w:rPr>
+          <w:szCs w:val="20"/>
+          <w:lang w:val="es-US"/>
+        </w:rPr>
+        <w:t xml:space="preserve">los hallazgos </w:t>
       </w:r>
       <w:r>
         <w:rPr>
@@ -5403,6 +5403,13 @@
           <w:szCs w:val="20"/>
           <w:lang w:val="es-US"/>
         </w:rPr>
+        <w:t>n</w:t>
+      </w:r>
+      <w:r>
+        <w:rPr>
+          <w:szCs w:val="20"/>
+          <w:lang w:val="es-US"/>
+        </w:rPr>
         <w:t xml:space="preserve"> que la </w:t>
       </w:r>
       <w:r>
@@ -5460,69 +5467,6 @@
           <w:lang w:val="es-US"/>
         </w:rPr>
         <w:t>to laboral, mientras que las mujeres experimentan una presión hacia una movilidad descendente.</w:t>
-      </w:r>
-      <w:r>
-        <w:rPr>
-          <w:szCs w:val="20"/>
-          <w:lang w:val="es-US"/>
-        </w:rPr>
-        <w:t xml:space="preserve"> </w:t>
-      </w:r>
-      <w:r>
-        <w:rPr>
-          <w:szCs w:val="20"/>
-          <w:lang w:val="es-US"/>
-        </w:rPr>
-        <w:t>Esta</w:t>
-      </w:r>
-      <w:r>
-        <w:rPr>
-          <w:szCs w:val="20"/>
-          <w:lang w:val="es-US"/>
-        </w:rPr>
-        <w:t xml:space="preserve"> información descriptiva </w:t>
-      </w:r>
-      <w:r>
-        <w:rPr>
-          <w:szCs w:val="20"/>
-          <w:lang w:val="es-US"/>
-        </w:rPr>
-        <w:t>pue</w:t>
-      </w:r>
-      <w:r>
-        <w:rPr>
-          <w:szCs w:val="20"/>
-          <w:lang w:val="es-US"/>
-        </w:rPr>
-        <w:t xml:space="preserve">de abrir el camino para </w:t>
-      </w:r>
-      <w:r>
-        <w:rPr>
-          <w:szCs w:val="20"/>
-          <w:lang w:val="es-US"/>
-        </w:rPr>
-        <w:t>desarrollar</w:t>
-      </w:r>
-      <w:r>
-        <w:rPr>
-          <w:szCs w:val="20"/>
-          <w:lang w:val="es-US"/>
-        </w:rPr>
-        <w:t xml:space="preserve"> una argumentación en ese sentido, de lo cual se esperaría una distribución similar </w:t>
-      </w:r>
-      <w:r>
-        <w:rPr>
-          <w:szCs w:val="20"/>
-          <w:lang w:val="es-US"/>
-        </w:rPr>
-        <w:t>a la de</w:t>
-      </w:r>
-      <w:r>
-        <w:rPr>
-          <w:szCs w:val="20"/>
-          <w:lang w:val="es-US"/>
-        </w:rPr>
-        <w:t xml:space="preserve"> los ingresos en el caso de la prevalencia de la informalidad en estos grupos poblacionales.</w:t>
       </w:r>
     </w:p>
     <w:p>
@@ -5665,21 +5609,18 @@
         <w:rPr>
           <w:sz w:val="20"/>
           <w:szCs w:val="20"/>
-          <w:lang w:val="es-US"/>
-        </w:rPr>
-      </w:pPr>
-      <w:r>
-        <w:rPr>
-          <w:noProof/>
+        </w:rPr>
+      </w:pPr>
+      <w:r>
+        <w:rPr>
           <w:sz w:val="20"/>
           <w:szCs w:val="20"/>
-          <w:lang w:val="es-US"/>
         </w:rPr>
         <w:drawing>
-          <wp:inline distT="0" distB="0" distL="0" distR="0" wp14:anchorId="3C4D2A46" wp14:editId="49E68887">
-            <wp:extent cx="4285679" cy="1835834"/>
-            <wp:effectExtent l="0" t="0" r="0" b="5715"/>
-            <wp:docPr id="293491581" name="Imagen 1"/>
+          <wp:inline distT="0" distB="0" distL="0" distR="0" wp14:anchorId="363FC262" wp14:editId="300FB663">
+            <wp:extent cx="4249797" cy="2273935"/>
+            <wp:effectExtent l="0" t="0" r="5080" b="0"/>
+            <wp:docPr id="1683349730" name="Imagen 1"/>
             <wp:cNvGraphicFramePr>
               <a:graphicFrameLocks xmlns:a="http://schemas.openxmlformats.org/drawingml/2006/main" noChangeAspect="1"/>
             </wp:cNvGraphicFramePr>
@@ -5687,7 +5628,7 @@
               <a:graphicData uri="http://schemas.openxmlformats.org/drawingml/2006/picture">
                 <pic:pic xmlns:pic="http://schemas.openxmlformats.org/drawingml/2006/picture">
                   <pic:nvPicPr>
-                    <pic:cNvPr id="293491581" name=""/>
+                    <pic:cNvPr id="1683349730" name=""/>
                     <pic:cNvPicPr/>
                   </pic:nvPicPr>
                   <pic:blipFill>
@@ -5699,7 +5640,7 @@
                   <pic:spPr>
                     <a:xfrm>
                       <a:off x="0" y="0"/>
-                      <a:ext cx="4433232" cy="1899041"/>
+                      <a:ext cx="4293081" cy="2297095"/>
                     </a:xfrm>
                     <a:prstGeom prst="rect">
                       <a:avLst/>
@@ -5788,44 +5729,55 @@
           <w:lang w:val="es-US"/>
         </w:rPr>
         <w:lastRenderedPageBreak/>
-        <w:t xml:space="preserve">La figura 4 muestra la distribución del ingreso correspondiente a la ocupación principal y del ingreso total individual para cada una de las condiciones laborales, con los ejes en escala logarítmica natural. En ambos paneles superiores, la distribución de los trabajadores informales avanza sistemáticamente hacia la izquierda de la de los formales, lo que evidencia una diferencia en términos de ingresos consistente con lo registrado por </w:t>
-      </w:r>
-      <w:sdt>
-        <w:sdtPr>
-          <w:rPr>
-            <w:rFonts w:cs="Times New Roman"/>
-            <w:color w:val="000000"/>
-            <w:szCs w:val="20"/>
-            <w:lang w:val="es-US"/>
-          </w:rPr>
-          <w:tag w:val="MENDELEY_CITATION_v3_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"/>
-          <w:id w:val="231281968"/>
-          <w:placeholder>
-            <w:docPart w:val="DefaultPlaceholder_-1854013440"/>
-          </w:placeholder>
-        </w:sdtPr>
-        <w:sdtContent>
-          <w:r>
-            <w:rPr>
-              <w:rFonts w:cs="Times New Roman"/>
-              <w:color w:val="000000"/>
-              <w:szCs w:val="20"/>
-              <w:lang w:val="es-US"/>
-            </w:rPr>
-            <w:t>Maurizio y Monsalvo (2021)</w:t>
-          </w:r>
-        </w:sdtContent>
-      </w:sdt>
-      <w:r>
-        <w:rPr>
-          <w:szCs w:val="20"/>
-          <w:lang w:val="es-US"/>
-        </w:rPr>
-        <w:t xml:space="preserve"> en el contexto latinoamericano. La distribución </w:t>
+        <w:t>La Figura 4 destaca cómo se distribuye</w:t>
+      </w:r>
+      <w:r>
+        <w:rPr>
+          <w:szCs w:val="20"/>
+          <w:lang w:val="es-US"/>
+        </w:rPr>
+        <w:t>n</w:t>
+      </w:r>
+      <w:r>
+        <w:rPr>
+          <w:szCs w:val="20"/>
+          <w:lang w:val="es-US"/>
+        </w:rPr>
+        <w:t xml:space="preserve"> el ingreso de la ocupación principal y el ingreso total individual </w:t>
+      </w:r>
+      <w:r>
+        <w:rPr>
+          <w:szCs w:val="20"/>
+          <w:lang w:val="es-US"/>
+        </w:rPr>
+        <w:t>de</w:t>
+      </w:r>
+      <w:r>
+        <w:rPr>
+          <w:szCs w:val="20"/>
+          <w:lang w:val="es-US"/>
+        </w:rPr>
+        <w:t xml:space="preserve"> los trabajadores formales e informales </w:t>
+      </w:r>
+      <w:r>
+        <w:rPr>
+          <w:szCs w:val="20"/>
+          <w:lang w:val="es-US"/>
+        </w:rPr>
+        <w:t>mediant</w:t>
+      </w:r>
+      <w:r>
+        <w:rPr>
+          <w:szCs w:val="20"/>
+          <w:lang w:val="es-US"/>
+        </w:rPr>
+        <w:t xml:space="preserve">e histogramas y un </w:t>
       </w:r>
       <w:proofErr w:type="spellStart"/>
       <w:r>
         <w:rPr>
+          <w:i/>
+          <w:iCs/>
           <w:szCs w:val="20"/>
           <w:lang w:val="es-US"/>
         </w:rPr>
@@ -5837,75 +5789,579 @@
           <w:szCs w:val="20"/>
           <w:lang w:val="es-US"/>
         </w:rPr>
-        <w:t xml:space="preserve"> del ingreso principal permite visualizar mejor esta separación: la curva del ingreso informal muestra un pico más abrupto y concentrado en valores menores, mientras que la del ingreso formal presenta una distribución más aplanada, desplazada hacia la derecha, lo </w:t>
-      </w:r>
-      <w:r>
-        <w:rPr>
-          <w:szCs w:val="20"/>
-          <w:lang w:val="es-US"/>
-        </w:rPr>
-        <w:t>que</w:t>
-      </w:r>
-      <w:r>
-        <w:rPr>
-          <w:szCs w:val="20"/>
-          <w:lang w:val="es-US"/>
-        </w:rPr>
-        <w:t xml:space="preserve"> da sustento no solo a menores ingresos medios, sino también a una mayor dispersión entre los trabajadores formales.</w:t>
+        <w:t xml:space="preserve"> gaussiano. En el caso del ingreso de la ocupación principal, la distribución </w:t>
+      </w:r>
+      <w:r>
+        <w:rPr>
+          <w:szCs w:val="20"/>
+          <w:lang w:val="es-US"/>
+        </w:rPr>
+        <w:t xml:space="preserve">presenta una forma unimodal, propia de los trabajadores formales, con un pico en torno a </w:t>
+      </w:r>
+      <w:r>
+        <w:rPr>
+          <w:szCs w:val="20"/>
+          <w:lang w:val="es-US"/>
+        </w:rPr>
+        <w:t>5</w:t>
+      </w:r>
+      <w:r>
+        <w:rPr>
+          <w:szCs w:val="20"/>
+          <w:lang w:val="es-US"/>
+        </w:rPr>
+        <w:t>00.000 pesos, una larga cola derecha y una</w:t>
+      </w:r>
+      <w:r>
+        <w:rPr>
+          <w:szCs w:val="20"/>
+          <w:lang w:val="es-US"/>
+        </w:rPr>
+        <w:t xml:space="preserve"> mayor dispersión. Esto significa que la heterogeneidad </w:t>
+      </w:r>
+      <w:r>
+        <w:rPr>
+          <w:szCs w:val="20"/>
+          <w:lang w:val="es-US"/>
+        </w:rPr>
+        <w:t>salarial</w:t>
+      </w:r>
+      <w:r>
+        <w:rPr>
+          <w:szCs w:val="20"/>
+          <w:lang w:val="es-US"/>
+        </w:rPr>
+        <w:t xml:space="preserve"> </w:t>
+      </w:r>
+      <w:r>
+        <w:rPr>
+          <w:szCs w:val="20"/>
+          <w:lang w:val="es-US"/>
+        </w:rPr>
+        <w:t>en</w:t>
+      </w:r>
+      <w:r>
+        <w:rPr>
+          <w:szCs w:val="20"/>
+          <w:lang w:val="es-US"/>
+        </w:rPr>
+        <w:t xml:space="preserve"> este grupo es mayor</w:t>
+      </w:r>
+      <w:r>
+        <w:rPr>
+          <w:szCs w:val="20"/>
+          <w:lang w:val="es-US"/>
+        </w:rPr>
+        <w:t>, mientras que,</w:t>
+      </w:r>
+      <w:r>
+        <w:rPr>
+          <w:szCs w:val="20"/>
+          <w:lang w:val="es-US"/>
+        </w:rPr>
+        <w:t xml:space="preserve"> </w:t>
+      </w:r>
+      <w:r>
+        <w:rPr>
+          <w:szCs w:val="20"/>
+          <w:lang w:val="es-US"/>
+        </w:rPr>
+        <w:t>p</w:t>
+      </w:r>
+      <w:r>
+        <w:rPr>
+          <w:szCs w:val="20"/>
+          <w:lang w:val="es-US"/>
+        </w:rPr>
+        <w:t>ara los trabajadores informales</w:t>
+      </w:r>
+      <w:r>
+        <w:rPr>
+          <w:szCs w:val="20"/>
+          <w:lang w:val="es-US"/>
+        </w:rPr>
+        <w:t>,</w:t>
+      </w:r>
+      <w:r>
+        <w:rPr>
+          <w:szCs w:val="20"/>
+          <w:lang w:val="es-US"/>
+        </w:rPr>
+        <w:t xml:space="preserve"> la distribución </w:t>
+      </w:r>
+      <w:r>
+        <w:rPr>
+          <w:szCs w:val="20"/>
+          <w:lang w:val="es-US"/>
+        </w:rPr>
+        <w:t>aglomera valores en rangos bajos de ingresos</w:t>
+      </w:r>
+      <w:r>
+        <w:rPr>
+          <w:szCs w:val="20"/>
+          <w:lang w:val="es-US"/>
+        </w:rPr>
+        <w:t xml:space="preserve"> y una cola derecha más corta, lo que implica niveles de ingresos</w:t>
+      </w:r>
+      <w:r>
+        <w:rPr>
+          <w:szCs w:val="20"/>
+          <w:lang w:val="es-US"/>
+        </w:rPr>
+        <w:t xml:space="preserve"> menores</w:t>
+      </w:r>
+      <w:r>
+        <w:rPr>
+          <w:szCs w:val="20"/>
+          <w:lang w:val="es-US"/>
+        </w:rPr>
+        <w:t xml:space="preserve"> y una distribución sistemáticamente</w:t>
+      </w:r>
+      <w:r>
+        <w:rPr>
+          <w:szCs w:val="20"/>
+          <w:lang w:val="es-US"/>
+        </w:rPr>
+        <w:t xml:space="preserve"> más comprimida.</w:t>
       </w:r>
     </w:p>
     <w:p>
-      <w:pPr>
-        <w:rPr>
-          <w:szCs w:val="20"/>
-          <w:lang w:val="es-US"/>
-        </w:rPr>
-      </w:pPr>
-      <w:r>
-        <w:rPr>
-          <w:szCs w:val="20"/>
-          <w:lang w:val="es-US"/>
-        </w:rPr>
-        <w:t xml:space="preserve">Los paneles inferiores, que se refieren a la misma variable de ingreso total individual, presentan un patrón similar, pero con una separación de grupos algo más acentuada, lo que podría ser indicativo de un acceso más elevado a fuentes de ingreso complementarias a la ocupación principal por parte de los trabajadores formales. Este patrón de los grupos de ingreso respalda la expectativa </w:t>
-      </w:r>
-      <w:r>
-        <w:rPr>
-          <w:szCs w:val="20"/>
-          <w:lang w:val="es-US"/>
-        </w:rPr>
-        <w:t>formulada</w:t>
-      </w:r>
-      <w:r>
-        <w:rPr>
-          <w:szCs w:val="20"/>
-          <w:lang w:val="es-US"/>
-        </w:rPr>
-        <w:t xml:space="preserve"> en el análisis anterior acerca de la presión diferencial que ejerce la informalidad sobre la variable de ingreso de distintos grupos de la población.</w:t>
+      <w:r>
+        <w:rPr>
+          <w:szCs w:val="20"/>
+          <w:lang w:val="es-US"/>
+        </w:rPr>
+        <w:t xml:space="preserve">De forma similar, el patrón se repite en los paneles del total de </w:t>
+      </w:r>
+      <w:r>
+        <w:rPr>
+          <w:szCs w:val="20"/>
+          <w:lang w:val="es-US"/>
+        </w:rPr>
+        <w:t>ingresos individuales, aunque las distribuciones están ligeramente más desplazadas a la derecha en ambos conjuntos, lo que explica</w:t>
+      </w:r>
+      <w:r>
+        <w:rPr>
+          <w:szCs w:val="20"/>
+          <w:lang w:val="es-US"/>
+        </w:rPr>
+        <w:t xml:space="preserve"> la inclusión de fuentes de ingreso complementarias a la ocupación de referencia. La combinación formal</w:t>
+      </w:r>
+      <w:r>
+        <w:rPr>
+          <w:szCs w:val="20"/>
+          <w:lang w:val="es-US"/>
+        </w:rPr>
+        <w:t>-</w:t>
+      </w:r>
+      <w:r>
+        <w:rPr>
+          <w:szCs w:val="20"/>
+          <w:lang w:val="es-US"/>
+        </w:rPr>
+        <w:t>informal se mantiene marcada</w:t>
+      </w:r>
+      <w:r>
+        <w:rPr>
+          <w:szCs w:val="20"/>
+          <w:lang w:val="es-US"/>
+        </w:rPr>
+        <w:t>:</w:t>
+      </w:r>
+      <w:r>
+        <w:rPr>
+          <w:szCs w:val="20"/>
+          <w:lang w:val="es-US"/>
+        </w:rPr>
+        <w:t xml:space="preserve"> por un lado, los formales alcanzan máximos </w:t>
+      </w:r>
+      <w:r>
+        <w:rPr>
+          <w:szCs w:val="20"/>
+          <w:lang w:val="es-US"/>
+        </w:rPr>
+        <w:t>cercan</w:t>
+      </w:r>
+      <w:r>
+        <w:rPr>
+          <w:szCs w:val="20"/>
+          <w:lang w:val="es-US"/>
+        </w:rPr>
+        <w:t xml:space="preserve">os a los </w:t>
+      </w:r>
+      <w:r>
+        <w:rPr>
+          <w:szCs w:val="20"/>
+          <w:lang w:val="es-US"/>
+        </w:rPr>
+        <w:t>4</w:t>
+      </w:r>
+      <w:r>
+        <w:rPr>
+          <w:szCs w:val="20"/>
+          <w:lang w:val="es-US"/>
+        </w:rPr>
+        <w:t>.</w:t>
+      </w:r>
+      <w:r>
+        <w:rPr>
+          <w:szCs w:val="20"/>
+          <w:lang w:val="es-US"/>
+        </w:rPr>
+        <w:t>0</w:t>
+      </w:r>
+      <w:r>
+        <w:rPr>
+          <w:szCs w:val="20"/>
+          <w:lang w:val="es-US"/>
+        </w:rPr>
+        <w:t xml:space="preserve">00.000 </w:t>
+      </w:r>
+      <w:r>
+        <w:rPr>
+          <w:szCs w:val="20"/>
+          <w:lang w:val="es-US"/>
+        </w:rPr>
+        <w:t xml:space="preserve">de </w:t>
+      </w:r>
+      <w:r>
+        <w:rPr>
+          <w:szCs w:val="20"/>
+          <w:lang w:val="es-US"/>
+        </w:rPr>
+        <w:t>pesos</w:t>
+      </w:r>
+      <w:r>
+        <w:rPr>
+          <w:szCs w:val="20"/>
+          <w:lang w:val="es-US"/>
+        </w:rPr>
+        <w:t xml:space="preserve"> en ingresos</w:t>
+      </w:r>
+      <w:r>
+        <w:rPr>
+          <w:szCs w:val="20"/>
+          <w:lang w:val="es-US"/>
+        </w:rPr>
+        <w:t xml:space="preserve"> totales</w:t>
+      </w:r>
+      <w:r>
+        <w:rPr>
+          <w:szCs w:val="20"/>
+          <w:lang w:val="es-US"/>
+        </w:rPr>
+        <w:t>,</w:t>
+      </w:r>
+      <w:r>
+        <w:rPr>
+          <w:szCs w:val="20"/>
+          <w:lang w:val="es-US"/>
+        </w:rPr>
+        <w:t xml:space="preserve"> mientras que los </w:t>
+      </w:r>
+      <w:r>
+        <w:rPr>
+          <w:szCs w:val="20"/>
+          <w:lang w:val="es-US"/>
+        </w:rPr>
+        <w:t>in</w:t>
+      </w:r>
+      <w:r>
+        <w:rPr>
+          <w:szCs w:val="20"/>
+          <w:lang w:val="es-US"/>
+        </w:rPr>
+        <w:t>formales rara</w:t>
+      </w:r>
+      <w:r>
+        <w:rPr>
+          <w:szCs w:val="20"/>
+          <w:lang w:val="es-US"/>
+        </w:rPr>
+        <w:t xml:space="preserve"> vez</w:t>
+      </w:r>
+      <w:r>
+        <w:rPr>
+          <w:szCs w:val="20"/>
+          <w:lang w:val="es-US"/>
+        </w:rPr>
+        <w:t xml:space="preserve"> s</w:t>
+      </w:r>
+      <w:r>
+        <w:rPr>
+          <w:szCs w:val="20"/>
+          <w:lang w:val="es-US"/>
+        </w:rPr>
+        <w:t>uper</w:t>
+      </w:r>
+      <w:r>
+        <w:rPr>
+          <w:szCs w:val="20"/>
+          <w:lang w:val="es-US"/>
+        </w:rPr>
+        <w:t>an los 1.</w:t>
+      </w:r>
+      <w:r>
+        <w:rPr>
+          <w:szCs w:val="20"/>
+          <w:lang w:val="es-US"/>
+        </w:rPr>
+        <w:t>750</w:t>
+      </w:r>
+      <w:r>
+        <w:rPr>
+          <w:szCs w:val="20"/>
+          <w:lang w:val="es-US"/>
+        </w:rPr>
+        <w:t>.000</w:t>
+      </w:r>
+      <w:r>
+        <w:rPr>
+          <w:szCs w:val="20"/>
+          <w:lang w:val="es-US"/>
+        </w:rPr>
+        <w:t xml:space="preserve"> </w:t>
+      </w:r>
+      <w:r>
+        <w:rPr>
+          <w:szCs w:val="20"/>
+          <w:lang w:val="es-US"/>
+        </w:rPr>
+        <w:t xml:space="preserve">de </w:t>
+      </w:r>
+      <w:r>
+        <w:rPr>
+          <w:szCs w:val="20"/>
+          <w:lang w:val="es-US"/>
+        </w:rPr>
+        <w:t xml:space="preserve">pesos. En ambas </w:t>
+      </w:r>
+      <w:r>
+        <w:rPr>
+          <w:szCs w:val="20"/>
+          <w:lang w:val="es-US"/>
+        </w:rPr>
+        <w:t xml:space="preserve">variables se manifiesta la misma asimetría positiva de las distribuciones, </w:t>
+      </w:r>
+      <w:r>
+        <w:t>especialmente entre los trabajadores formales, lo cual es consistente con la presencia de trabajadores de altos ingresos en ese segmento y con la heterogeneidad salarial propia del empleo formal argentino.</w:t>
       </w:r>
     </w:p>
     <w:p>
       <w:pPr>
-        <w:pStyle w:val="Ttulo1"/>
-        <w:rPr>
-          <w:szCs w:val="20"/>
-        </w:rPr>
-      </w:pPr>
-      <w:r>
-        <w:rPr>
-          <w:szCs w:val="20"/>
-          <w:lang w:val="es-US"/>
-        </w:rPr>
-        <w:t xml:space="preserve">Reflexiones </w:t>
-      </w:r>
-      <w:r>
-        <w:rPr>
-          <w:szCs w:val="20"/>
-        </w:rPr>
-        <w:t>finales</w:t>
+        <w:rPr>
+          <w:szCs w:val="20"/>
+          <w:lang w:val="es-US"/>
+        </w:rPr>
+      </w:pPr>
+      <w:r>
+        <w:rPr>
+          <w:szCs w:val="20"/>
+          <w:lang w:val="es-US"/>
+        </w:rPr>
+        <w:t>Las variables de ingresos empleadas en el análisis p</w:t>
+      </w:r>
+      <w:r>
+        <w:rPr>
+          <w:szCs w:val="20"/>
+          <w:lang w:val="es-US"/>
+        </w:rPr>
+        <w:t>resenta</w:t>
+      </w:r>
+      <w:r>
+        <w:rPr>
+          <w:szCs w:val="20"/>
+          <w:lang w:val="es-US"/>
+        </w:rPr>
+        <w:t>n</w:t>
+      </w:r>
+      <w:r>
+        <w:rPr>
+          <w:szCs w:val="20"/>
+          <w:lang w:val="es-US"/>
+        </w:rPr>
+        <w:t xml:space="preserve"> algunos</w:t>
+      </w:r>
+      <w:r>
+        <w:rPr>
+          <w:szCs w:val="20"/>
+          <w:lang w:val="es-US"/>
+        </w:rPr>
+        <w:t xml:space="preserve"> inconvenientes </w:t>
+      </w:r>
+      <w:r>
+        <w:rPr>
+          <w:szCs w:val="20"/>
+          <w:lang w:val="es-US"/>
+        </w:rPr>
+        <w:t>en</w:t>
+      </w:r>
+      <w:r>
+        <w:rPr>
+          <w:szCs w:val="20"/>
+          <w:lang w:val="es-US"/>
+        </w:rPr>
+        <w:t xml:space="preserve"> su interpretación. El primero</w:t>
+      </w:r>
+      <w:r>
+        <w:rPr>
+          <w:szCs w:val="20"/>
+          <w:lang w:val="es-US"/>
+        </w:rPr>
+        <w:t xml:space="preserve"> consiste en que</w:t>
+      </w:r>
+      <w:r>
+        <w:rPr>
+          <w:szCs w:val="20"/>
+          <w:lang w:val="es-US"/>
+        </w:rPr>
+        <w:t xml:space="preserve"> los ingresos de la actividad principal (P21</w:t>
+      </w:r>
+      <w:r>
+        <w:rPr>
+          <w:szCs w:val="20"/>
+          <w:lang w:val="es-US"/>
+        </w:rPr>
+        <w:t>)</w:t>
+      </w:r>
+      <w:r>
+        <w:rPr>
+          <w:szCs w:val="20"/>
+          <w:lang w:val="es-US"/>
+        </w:rPr>
+        <w:t xml:space="preserve"> </w:t>
+      </w:r>
+      <w:r>
+        <w:rPr>
+          <w:szCs w:val="20"/>
+          <w:lang w:val="es-US"/>
+        </w:rPr>
+        <w:t>no reflejan</w:t>
+      </w:r>
+      <w:r>
+        <w:rPr>
+          <w:szCs w:val="20"/>
+          <w:lang w:val="es-US"/>
+        </w:rPr>
+        <w:t xml:space="preserve"> el ingreso total del trabajador al no tener en cuenta la actividad laboral secundaria </w:t>
+      </w:r>
+      <w:r>
+        <w:rPr>
+          <w:szCs w:val="20"/>
+          <w:lang w:val="es-US"/>
+        </w:rPr>
+        <w:t>ni</w:t>
+      </w:r>
+      <w:r>
+        <w:rPr>
+          <w:szCs w:val="20"/>
+          <w:lang w:val="es-US"/>
+        </w:rPr>
+        <w:t xml:space="preserve"> las actividades no laborales. </w:t>
+      </w:r>
+      <w:r>
+        <w:rPr>
+          <w:szCs w:val="20"/>
+          <w:lang w:val="es-US"/>
+        </w:rPr>
+        <w:t>En segundo lugar, los ingresos totales de las personas (P47T), si bien recogen todas las fuentes de ingresos, podrían generar heterogeneidad en la comparación entre formales e informales, dada la inclusión de transferencias, pensiones o rentas que pueden considerarse</w:t>
+      </w:r>
+      <w:r>
+        <w:rPr>
+          <w:szCs w:val="20"/>
+          <w:lang w:val="es-US"/>
+        </w:rPr>
+        <w:t xml:space="preserve"> ingresos no de</w:t>
+      </w:r>
+      <w:r>
+        <w:rPr>
+          <w:szCs w:val="20"/>
+          <w:lang w:val="es-US"/>
+        </w:rPr>
+        <w:t>rivados</w:t>
+      </w:r>
+      <w:r>
+        <w:rPr>
+          <w:szCs w:val="20"/>
+          <w:lang w:val="es-US"/>
+        </w:rPr>
+        <w:t xml:space="preserve"> de la condición de trabajo examinada. Además, </w:t>
+      </w:r>
+      <w:r>
+        <w:rPr>
+          <w:szCs w:val="20"/>
+          <w:lang w:val="es-US"/>
+        </w:rPr>
+        <w:t>amba</w:t>
+      </w:r>
+      <w:r>
+        <w:rPr>
+          <w:szCs w:val="20"/>
+          <w:lang w:val="es-US"/>
+        </w:rPr>
+        <w:t xml:space="preserve">s variables pueden estar sometidas a </w:t>
+      </w:r>
+      <w:proofErr w:type="spellStart"/>
+      <w:r>
+        <w:rPr>
+          <w:szCs w:val="20"/>
+          <w:lang w:val="es-US"/>
+        </w:rPr>
+        <w:t>subdeclaración</w:t>
+      </w:r>
+      <w:proofErr w:type="spellEnd"/>
+      <w:r>
+        <w:rPr>
+          <w:szCs w:val="20"/>
+          <w:lang w:val="es-US"/>
+        </w:rPr>
+        <w:t xml:space="preserve">, un problema que se </w:t>
+      </w:r>
+      <w:r>
+        <w:rPr>
+          <w:szCs w:val="20"/>
+          <w:lang w:val="es-US"/>
+        </w:rPr>
+        <w:t>agrav</w:t>
+      </w:r>
+      <w:r>
+        <w:rPr>
+          <w:szCs w:val="20"/>
+          <w:lang w:val="es-US"/>
+        </w:rPr>
+        <w:t>a en el sector informal</w:t>
+      </w:r>
+      <w:r>
+        <w:rPr>
+          <w:szCs w:val="20"/>
+          <w:lang w:val="es-US"/>
+        </w:rPr>
+        <w:t>.</w:t>
       </w:r>
     </w:p>
     <w:p>
       <w:pPr>
+        <w:pStyle w:val="Ttulo1"/>
+        <w:rPr>
+          <w:szCs w:val="20"/>
+        </w:rPr>
+      </w:pPr>
+      <w:r>
+        <w:rPr>
+          <w:szCs w:val="20"/>
+          <w:lang w:val="es-US"/>
+        </w:rPr>
+        <w:t xml:space="preserve">Reflexiones </w:t>
+      </w:r>
+      <w:r>
+        <w:rPr>
+          <w:szCs w:val="20"/>
+        </w:rPr>
+        <w:t>finales</w:t>
+      </w:r>
+    </w:p>
+    <w:p>
+      <w:pPr>
         <w:rPr>
           <w:szCs w:val="20"/>
         </w:rPr>
@@ -6047,7 +6503,21 @@
           <w:szCs w:val="20"/>
           <w:lang w:val="es-US"/>
         </w:rPr>
-        <w:t xml:space="preserve"> el análisis. Se colaboró con la inteligencia artificial para contrastar los niveles y tipos de las variables seleccionadas con los diccionarios oficiales. El proceso se apoyó en la inteligencia artificial (IA) para construir las bases de datos derivadas de la condición de actividad y generar variables dicotómicas según criterios de codificación establecidos. Se utilizó también el soporte de la IA para el renombramiento de variables conforme a las pautas estándar; se solicitó ayuda para ajustar los ingresos por inflación entre períodos y para elaborar herramientas descriptivas, como tablas de frecuencia y matrices de correlación, con variables continuas o categóricas. Esta colaboración permitió estructurar la preparación de la base analítica en un marco ordenado y transparente.</w:t>
+        <w:t xml:space="preserve"> el análisis. Se colaboró con la inteligencia artificial para contrastar los niveles y tipos de las variables seleccionadas con los diccionarios oficiales. El proceso se apoyó en la inteligencia artificial (IA) para construir las bases de datos derivadas de la condición de actividad y generar variables dicotómicas según criterios de codificación establecidos. Se utilizó también el soporte de la IA para el renombramiento de variables conforme a las pautas estándar; se solicitó </w:t>
+      </w:r>
+      <w:r>
+        <w:rPr>
+          <w:szCs w:val="20"/>
+          <w:lang w:val="es-US"/>
+        </w:rPr>
+        <w:t>soporte</w:t>
+      </w:r>
+      <w:r>
+        <w:rPr>
+          <w:szCs w:val="20"/>
+          <w:lang w:val="es-US"/>
+        </w:rPr>
+        <w:t xml:space="preserve"> para ajustar los ingresos por inflación entre períodos y para elaborar herramientas descriptivas, como tablas de frecuencia y matrices de correlación, con variables continuas o categóricas.</w:t>
       </w:r>
     </w:p>
     <w:p>
@@ -6124,7 +6594,31 @@
         <w:rPr>
           <w:szCs w:val="20"/>
         </w:rPr>
-        <w:t>e 12 horas. Se espera que este tiempo se reduzca en los próximos entregables, considerando además el escaso margen temporal entre ellos</w:t>
+        <w:t>e 12 horas. Se espera que este tiempo se reduzca en los próximos entregables, considerando</w:t>
+      </w:r>
+      <w:r>
+        <w:rPr>
+          <w:szCs w:val="20"/>
+        </w:rPr>
+        <w:t>,</w:t>
+      </w:r>
+      <w:r>
+        <w:rPr>
+          <w:szCs w:val="20"/>
+        </w:rPr>
+        <w:t xml:space="preserve"> además</w:t>
+      </w:r>
+      <w:r>
+        <w:rPr>
+          <w:szCs w:val="20"/>
+        </w:rPr>
+        <w:t>,</w:t>
+      </w:r>
+      <w:r>
+        <w:rPr>
+          <w:szCs w:val="20"/>
+        </w:rPr>
+        <w:t xml:space="preserve"> el escaso margen temporal entre ellos</w:t>
       </w:r>
       <w:r>
         <w:rPr>
@@ -6138,15 +6632,6 @@
         </w:rPr>
         <w:t xml:space="preserve"> y la existencia de otras responsabilidades que deben atenderse en paralelo.</w:t>
       </w:r>
-    </w:p>
-    <w:p>
-      <w:pPr>
-        <w:spacing w:line="259" w:lineRule="auto"/>
-        <w:jc w:val="left"/>
-        <w:rPr>
-          <w:szCs w:val="20"/>
-        </w:rPr>
-      </w:pPr>
       <w:r>
         <w:rPr>
           <w:szCs w:val="20"/>
@@ -6856,7 +7341,7 @@
       <w:pPr>
         <w:pStyle w:val="Descripcin"/>
         <w:keepNext/>
-        <w:ind w:left="993" w:right="990"/>
+        <w:ind w:left="1418" w:right="1416"/>
       </w:pPr>
       <w:r>
         <w:lastRenderedPageBreak/>
@@ -6914,9 +7399,9 @@
           <w:noProof/>
         </w:rPr>
         <w:drawing>
-          <wp:inline distT="0" distB="0" distL="0" distR="0" wp14:anchorId="30E13B00" wp14:editId="1605C270">
-            <wp:extent cx="4489554" cy="7266762"/>
-            <wp:effectExtent l="0" t="0" r="0" b="0"/>
+          <wp:inline distT="0" distB="0" distL="0" distR="0" wp14:anchorId="30E13B00" wp14:editId="6EA8C54F">
+            <wp:extent cx="4833878" cy="7824083"/>
+            <wp:effectExtent l="0" t="0" r="5080" b="0"/>
             <wp:docPr id="7" name="Imagen 7"/>
             <wp:cNvGraphicFramePr>
               <a:graphicFrameLocks xmlns:a="http://schemas.openxmlformats.org/drawingml/2006/main" noChangeAspect="1"/>
@@ -6946,7 +7431,7 @@
                   <pic:spPr bwMode="auto">
                     <a:xfrm>
                       <a:off x="0" y="0"/>
-                      <a:ext cx="4498568" cy="7281352"/>
+                      <a:ext cx="4855523" cy="7859118"/>
                     </a:xfrm>
                     <a:prstGeom prst="rect">
                       <a:avLst/>
@@ -6962,22 +7447,1081 @@
           </wp:inline>
         </w:drawing>
       </w:r>
-      <w:r>
-        <w:rPr>
-          <w:i/>
-          <w:iCs/>
-          <w:sz w:val="16"/>
-          <w:szCs w:val="16"/>
-        </w:rPr>
-        <w:br w:type="page"/>
-      </w:r>
     </w:p>
     <w:p>
       <w:pPr>
+        <w:spacing w:line="259" w:lineRule="auto"/>
+        <w:jc w:val="left"/>
+      </w:pPr>
+      <w:r>
+        <w:br w:type="page"/>
+      </w:r>
+    </w:p>
+    <w:p>
+      <w:pPr>
+        <w:pStyle w:val="Descripcin"/>
+        <w:ind w:left="2410" w:right="2408"/>
+      </w:pPr>
+      <w:r>
+        <w:lastRenderedPageBreak/>
+        <w:t xml:space="preserve">Anexo </w:t>
+      </w:r>
+      <w:r>
+        <w:fldChar w:fldCharType="begin"/>
+      </w:r>
+      <w:r>
+        <w:instrText xml:space="preserve"> SEQ Anexo \* ARABIC </w:instrText>
+      </w:r>
+      <w:r>
+        <w:fldChar w:fldCharType="separate"/>
+      </w:r>
+      <w:r>
+        <w:rPr>
+          <w:noProof/>
+        </w:rPr>
+        <w:t>3</w:t>
+      </w:r>
+      <w:r>
+        <w:fldChar w:fldCharType="end"/>
+      </w:r>
+      <w:r>
+        <w:tab/>
+      </w:r>
+      <w:r>
+        <w:br/>
+      </w:r>
+      <w:r>
+        <w:rPr>
+          <w:b w:val="0"/>
+          <w:bCs/>
+          <w:i/>
+          <w:iCs w:val="0"/>
+        </w:rPr>
+        <w:t xml:space="preserve">Exploración de </w:t>
+      </w:r>
+      <w:proofErr w:type="spellStart"/>
+      <w:r>
+        <w:rPr>
+          <w:b w:val="0"/>
+          <w:bCs/>
+          <w:i/>
+          <w:iCs w:val="0"/>
+        </w:rPr>
+        <w:t>kernels</w:t>
+      </w:r>
+      <w:proofErr w:type="spellEnd"/>
+      <w:r>
+        <w:rPr>
+          <w:b w:val="0"/>
+          <w:bCs/>
+          <w:i/>
+          <w:iCs w:val="0"/>
+        </w:rPr>
+        <w:t xml:space="preserve"> en la distribución de la población categorizada</w:t>
+      </w:r>
+      <w:r>
+        <w:rPr>
+          <w:b w:val="0"/>
+          <w:bCs/>
+          <w:i/>
+          <w:iCs w:val="0"/>
+        </w:rPr>
+        <w:t xml:space="preserve"> </w:t>
+      </w:r>
+      <w:r>
+        <w:rPr>
+          <w:b w:val="0"/>
+          <w:bCs/>
+          <w:i/>
+          <w:iCs w:val="0"/>
+        </w:rPr>
+        <w:t>como informal en el mercado laboral</w:t>
+      </w:r>
+      <w:r>
+        <w:rPr>
+          <w:b w:val="0"/>
+          <w:bCs/>
+          <w:i/>
+          <w:iCs w:val="0"/>
+        </w:rPr>
+        <w:t xml:space="preserve"> según su ingreso </w:t>
+      </w:r>
+      <w:r>
+        <w:rPr>
+          <w:b w:val="0"/>
+          <w:bCs/>
+          <w:i/>
+          <w:iCs w:val="0"/>
+        </w:rPr>
+        <w:t>principal</w:t>
+      </w:r>
+    </w:p>
+    <w:p>
+      <w:pPr>
+        <w:pStyle w:val="Sinespaciado"/>
+        <w:jc w:val="center"/>
+      </w:pPr>
+      <w:r>
+        <w:drawing>
+          <wp:inline distT="0" distB="0" distL="0" distR="0" wp14:anchorId="17F7DD67" wp14:editId="7982DED2">
+            <wp:extent cx="3574110" cy="2395008"/>
+            <wp:effectExtent l="0" t="0" r="0" b="5715"/>
+            <wp:docPr id="1395847206" name="Imagen 1"/>
+            <wp:cNvGraphicFramePr>
+              <a:graphicFrameLocks xmlns:a="http://schemas.openxmlformats.org/drawingml/2006/main" noChangeAspect="1"/>
+            </wp:cNvGraphicFramePr>
+            <a:graphic xmlns:a="http://schemas.openxmlformats.org/drawingml/2006/main">
+              <a:graphicData uri="http://schemas.openxmlformats.org/drawingml/2006/picture">
+                <pic:pic xmlns:pic="http://schemas.openxmlformats.org/drawingml/2006/picture">
+                  <pic:nvPicPr>
+                    <pic:cNvPr id="1395847206" name=""/>
+                    <pic:cNvPicPr/>
+                  </pic:nvPicPr>
+                  <pic:blipFill>
+                    <a:blip r:embed="rId21"/>
+                    <a:stretch>
+                      <a:fillRect/>
+                    </a:stretch>
+                  </pic:blipFill>
+                  <pic:spPr>
+                    <a:xfrm>
+                      <a:off x="0" y="0"/>
+                      <a:ext cx="3616162" cy="2423187"/>
+                    </a:xfrm>
+                    <a:prstGeom prst="rect">
+                      <a:avLst/>
+                    </a:prstGeom>
+                  </pic:spPr>
+                </pic:pic>
+              </a:graphicData>
+            </a:graphic>
+          </wp:inline>
+        </w:drawing>
+      </w:r>
+    </w:p>
+    <w:p>
+      <w:pPr>
+        <w:pStyle w:val="Descripcin"/>
+        <w:spacing w:before="240"/>
+        <w:ind w:left="2410" w:right="2408"/>
+      </w:pPr>
+      <w:r>
+        <w:t xml:space="preserve">Anexo </w:t>
+      </w:r>
+      <w:r>
+        <w:fldChar w:fldCharType="begin"/>
+      </w:r>
+      <w:r>
+        <w:instrText xml:space="preserve"> SEQ Anexo \* ARABIC </w:instrText>
+      </w:r>
+      <w:r>
+        <w:fldChar w:fldCharType="separate"/>
+      </w:r>
+      <w:r>
+        <w:rPr>
+          <w:noProof/>
+        </w:rPr>
+        <w:t>4</w:t>
+      </w:r>
+      <w:r>
+        <w:fldChar w:fldCharType="end"/>
+      </w:r>
+      <w:r>
+        <w:tab/>
+      </w:r>
+      <w:r>
+        <w:br/>
+      </w:r>
+      <w:r>
+        <w:rPr>
+          <w:b w:val="0"/>
+          <w:bCs/>
+          <w:i/>
+          <w:iCs w:val="0"/>
+        </w:rPr>
+        <w:t xml:space="preserve">Exploración de </w:t>
+      </w:r>
+      <w:proofErr w:type="spellStart"/>
+      <w:r>
+        <w:rPr>
+          <w:b w:val="0"/>
+          <w:bCs/>
+          <w:i/>
+          <w:iCs w:val="0"/>
+        </w:rPr>
+        <w:t>bandwidths</w:t>
+      </w:r>
+      <w:proofErr w:type="spellEnd"/>
+      <w:r>
+        <w:rPr>
+          <w:b w:val="0"/>
+          <w:bCs/>
+          <w:i/>
+          <w:iCs w:val="0"/>
+        </w:rPr>
+        <w:t xml:space="preserve"> en la distribución </w:t>
+      </w:r>
+      <w:r>
+        <w:rPr>
+          <w:b w:val="0"/>
+          <w:bCs/>
+          <w:i/>
+          <w:iCs w:val="0"/>
+        </w:rPr>
+        <w:t>poblacional</w:t>
+      </w:r>
+      <w:r>
+        <w:rPr>
+          <w:b w:val="0"/>
+          <w:bCs/>
+          <w:i/>
+          <w:iCs w:val="0"/>
+        </w:rPr>
+        <w:t xml:space="preserve"> formal en el mercado laboral</w:t>
+      </w:r>
+      <w:r>
+        <w:rPr>
+          <w:b w:val="0"/>
+          <w:bCs/>
+          <w:i/>
+          <w:iCs w:val="0"/>
+        </w:rPr>
+        <w:t xml:space="preserve"> según su ingreso p</w:t>
+      </w:r>
+      <w:r>
+        <w:rPr>
+          <w:b w:val="0"/>
+          <w:bCs/>
+          <w:i/>
+          <w:iCs w:val="0"/>
+        </w:rPr>
+        <w:t>rincipal</w:t>
+      </w:r>
+    </w:p>
+    <w:p>
+      <w:pPr>
+        <w:pStyle w:val="Sinespaciado"/>
+        <w:jc w:val="center"/>
+      </w:pPr>
+      <w:r>
+        <w:drawing>
+          <wp:inline distT="0" distB="0" distL="0" distR="0" wp14:anchorId="7EDD14C5" wp14:editId="46DF90B4">
+            <wp:extent cx="3590676" cy="2406109"/>
+            <wp:effectExtent l="0" t="0" r="3810" b="0"/>
+            <wp:docPr id="433775511" name="Imagen 1"/>
+            <wp:cNvGraphicFramePr>
+              <a:graphicFrameLocks xmlns:a="http://schemas.openxmlformats.org/drawingml/2006/main" noChangeAspect="1"/>
+            </wp:cNvGraphicFramePr>
+            <a:graphic xmlns:a="http://schemas.openxmlformats.org/drawingml/2006/main">
+              <a:graphicData uri="http://schemas.openxmlformats.org/drawingml/2006/picture">
+                <pic:pic xmlns:pic="http://schemas.openxmlformats.org/drawingml/2006/picture">
+                  <pic:nvPicPr>
+                    <pic:cNvPr id="433775511" name=""/>
+                    <pic:cNvPicPr/>
+                  </pic:nvPicPr>
+                  <pic:blipFill>
+                    <a:blip r:embed="rId22"/>
+                    <a:stretch>
+                      <a:fillRect/>
+                    </a:stretch>
+                  </pic:blipFill>
+                  <pic:spPr>
+                    <a:xfrm>
+                      <a:off x="0" y="0"/>
+                      <a:ext cx="3620789" cy="2426288"/>
+                    </a:xfrm>
+                    <a:prstGeom prst="rect">
+                      <a:avLst/>
+                    </a:prstGeom>
+                  </pic:spPr>
+                </pic:pic>
+              </a:graphicData>
+            </a:graphic>
+          </wp:inline>
+        </w:drawing>
+      </w:r>
+    </w:p>
+    <w:p>
+      <w:pPr>
+        <w:pStyle w:val="Descripcin"/>
+        <w:spacing w:before="240"/>
+        <w:ind w:left="2410" w:right="2408"/>
+      </w:pPr>
+      <w:r>
+        <w:t xml:space="preserve">Anexo </w:t>
+      </w:r>
+      <w:r>
+        <w:fldChar w:fldCharType="begin"/>
+      </w:r>
+      <w:r>
+        <w:instrText xml:space="preserve"> SEQ Anexo \* ARABIC </w:instrText>
+      </w:r>
+      <w:r>
+        <w:fldChar w:fldCharType="separate"/>
+      </w:r>
+      <w:r>
+        <w:rPr>
+          <w:noProof/>
+        </w:rPr>
+        <w:t>5</w:t>
+      </w:r>
+      <w:r>
+        <w:fldChar w:fldCharType="end"/>
+      </w:r>
+      <w:r>
+        <w:tab/>
+      </w:r>
+      <w:r>
+        <w:br/>
+      </w:r>
+      <w:r>
+        <w:rPr>
+          <w:b w:val="0"/>
+          <w:bCs/>
+          <w:i/>
+          <w:iCs w:val="0"/>
+        </w:rPr>
+        <w:t xml:space="preserve">Exploración de </w:t>
+      </w:r>
+      <w:proofErr w:type="spellStart"/>
+      <w:r>
+        <w:rPr>
+          <w:b w:val="0"/>
+          <w:bCs/>
+          <w:i/>
+          <w:iCs w:val="0"/>
+        </w:rPr>
+        <w:t>kernels</w:t>
+      </w:r>
+      <w:proofErr w:type="spellEnd"/>
+      <w:r>
+        <w:rPr>
+          <w:b w:val="0"/>
+          <w:bCs/>
+          <w:i/>
+          <w:iCs w:val="0"/>
+        </w:rPr>
+        <w:t xml:space="preserve"> en la distribución de la población categorizada como </w:t>
+      </w:r>
+      <w:r>
+        <w:rPr>
+          <w:b w:val="0"/>
+          <w:bCs/>
+          <w:i/>
+          <w:iCs w:val="0"/>
+        </w:rPr>
+        <w:t>in</w:t>
+      </w:r>
+      <w:r>
+        <w:rPr>
+          <w:b w:val="0"/>
+          <w:bCs/>
+          <w:i/>
+          <w:iCs w:val="0"/>
+        </w:rPr>
+        <w:t>formal en el mercado laboral</w:t>
+      </w:r>
+      <w:r>
+        <w:rPr>
+          <w:b w:val="0"/>
+          <w:bCs/>
+          <w:i/>
+          <w:iCs w:val="0"/>
+        </w:rPr>
+        <w:t xml:space="preserve"> según su ingreso principal</w:t>
+      </w:r>
+    </w:p>
+    <w:p>
+      <w:pPr>
+        <w:pStyle w:val="Sinespaciado"/>
+        <w:jc w:val="center"/>
+      </w:pPr>
+      <w:r>
+        <w:drawing>
+          <wp:inline distT="0" distB="0" distL="0" distR="0" wp14:anchorId="535D27BB" wp14:editId="078A7255">
+            <wp:extent cx="3528974" cy="2305879"/>
+            <wp:effectExtent l="0" t="0" r="1905" b="5715"/>
+            <wp:docPr id="174512112" name="Imagen 1"/>
+            <wp:cNvGraphicFramePr>
+              <a:graphicFrameLocks xmlns:a="http://schemas.openxmlformats.org/drawingml/2006/main" noChangeAspect="1"/>
+            </wp:cNvGraphicFramePr>
+            <a:graphic xmlns:a="http://schemas.openxmlformats.org/drawingml/2006/main">
+              <a:graphicData uri="http://schemas.openxmlformats.org/drawingml/2006/picture">
+                <pic:pic xmlns:pic="http://schemas.openxmlformats.org/drawingml/2006/picture">
+                  <pic:nvPicPr>
+                    <pic:cNvPr id="174512112" name=""/>
+                    <pic:cNvPicPr/>
+                  </pic:nvPicPr>
+                  <pic:blipFill>
+                    <a:blip r:embed="rId23"/>
+                    <a:stretch>
+                      <a:fillRect/>
+                    </a:stretch>
+                  </pic:blipFill>
+                  <pic:spPr>
+                    <a:xfrm>
+                      <a:off x="0" y="0"/>
+                      <a:ext cx="3559648" cy="2325922"/>
+                    </a:xfrm>
+                    <a:prstGeom prst="rect">
+                      <a:avLst/>
+                    </a:prstGeom>
+                  </pic:spPr>
+                </pic:pic>
+              </a:graphicData>
+            </a:graphic>
+          </wp:inline>
+        </w:drawing>
+      </w:r>
+    </w:p>
+    <w:p>
+      <w:pPr>
+        <w:pStyle w:val="Descripcin"/>
+        <w:spacing w:before="240"/>
+        <w:ind w:left="2410" w:right="2408"/>
+      </w:pPr>
+      <w:r>
+        <w:lastRenderedPageBreak/>
+        <w:t xml:space="preserve">Anexo </w:t>
+      </w:r>
+      <w:r>
+        <w:fldChar w:fldCharType="begin"/>
+      </w:r>
+      <w:r>
+        <w:instrText xml:space="preserve"> SEQ Anexo \* ARABIC </w:instrText>
+      </w:r>
+      <w:r>
+        <w:fldChar w:fldCharType="separate"/>
+      </w:r>
+      <w:r>
+        <w:rPr>
+          <w:noProof/>
+        </w:rPr>
+        <w:t>6</w:t>
+      </w:r>
+      <w:r>
+        <w:fldChar w:fldCharType="end"/>
+      </w:r>
+      <w:r>
+        <w:tab/>
+      </w:r>
+      <w:r>
+        <w:br/>
+      </w:r>
+      <w:r>
+        <w:rPr>
+          <w:b w:val="0"/>
+          <w:bCs/>
+          <w:i/>
+          <w:iCs w:val="0"/>
+        </w:rPr>
+        <w:t xml:space="preserve">Exploración de </w:t>
+      </w:r>
+      <w:proofErr w:type="spellStart"/>
+      <w:r>
+        <w:rPr>
+          <w:b w:val="0"/>
+          <w:bCs/>
+          <w:i/>
+          <w:iCs w:val="0"/>
+        </w:rPr>
+        <w:t>bandwidths</w:t>
+      </w:r>
+      <w:proofErr w:type="spellEnd"/>
+      <w:r>
+        <w:rPr>
+          <w:b w:val="0"/>
+          <w:bCs/>
+          <w:i/>
+          <w:iCs w:val="0"/>
+        </w:rPr>
+        <w:t xml:space="preserve"> en la distribución </w:t>
+      </w:r>
+      <w:r>
+        <w:rPr>
+          <w:b w:val="0"/>
+          <w:bCs/>
+          <w:i/>
+          <w:iCs w:val="0"/>
+        </w:rPr>
+        <w:t>poblacional</w:t>
+      </w:r>
+      <w:r>
+        <w:rPr>
+          <w:b w:val="0"/>
+          <w:bCs/>
+          <w:i/>
+          <w:iCs w:val="0"/>
+        </w:rPr>
+        <w:t xml:space="preserve"> </w:t>
+      </w:r>
+      <w:r>
+        <w:rPr>
+          <w:b w:val="0"/>
+          <w:bCs/>
+          <w:i/>
+          <w:iCs w:val="0"/>
+        </w:rPr>
+        <w:t>in</w:t>
+      </w:r>
+      <w:r>
+        <w:rPr>
+          <w:b w:val="0"/>
+          <w:bCs/>
+          <w:i/>
+          <w:iCs w:val="0"/>
+        </w:rPr>
+        <w:t>formal en el mercado laboral</w:t>
+      </w:r>
+      <w:r>
+        <w:rPr>
+          <w:b w:val="0"/>
+          <w:bCs/>
+          <w:i/>
+          <w:iCs w:val="0"/>
+        </w:rPr>
+        <w:t xml:space="preserve"> según su ingreso principal</w:t>
+      </w:r>
+    </w:p>
+    <w:p>
+      <w:pPr>
+        <w:pStyle w:val="Sinespaciado"/>
+        <w:jc w:val="center"/>
+      </w:pPr>
+      <w:r>
+        <w:drawing>
+          <wp:inline distT="0" distB="0" distL="0" distR="0" wp14:anchorId="4CFEA60E" wp14:editId="1FF6DFBD">
+            <wp:extent cx="3601986" cy="2353586"/>
+            <wp:effectExtent l="0" t="0" r="5080" b="0"/>
+            <wp:docPr id="498357829" name="Imagen 1"/>
+            <wp:cNvGraphicFramePr>
+              <a:graphicFrameLocks xmlns:a="http://schemas.openxmlformats.org/drawingml/2006/main" noChangeAspect="1"/>
+            </wp:cNvGraphicFramePr>
+            <a:graphic xmlns:a="http://schemas.openxmlformats.org/drawingml/2006/main">
+              <a:graphicData uri="http://schemas.openxmlformats.org/drawingml/2006/picture">
+                <pic:pic xmlns:pic="http://schemas.openxmlformats.org/drawingml/2006/picture">
+                  <pic:nvPicPr>
+                    <pic:cNvPr id="498357829" name=""/>
+                    <pic:cNvPicPr/>
+                  </pic:nvPicPr>
+                  <pic:blipFill>
+                    <a:blip r:embed="rId24"/>
+                    <a:stretch>
+                      <a:fillRect/>
+                    </a:stretch>
+                  </pic:blipFill>
+                  <pic:spPr>
+                    <a:xfrm>
+                      <a:off x="0" y="0"/>
+                      <a:ext cx="3632298" cy="2373392"/>
+                    </a:xfrm>
+                    <a:prstGeom prst="rect">
+                      <a:avLst/>
+                    </a:prstGeom>
+                  </pic:spPr>
+                </pic:pic>
+              </a:graphicData>
+            </a:graphic>
+          </wp:inline>
+        </w:drawing>
+      </w:r>
+      <w:r>
+        <w:t xml:space="preserve"> </w:t>
+      </w:r>
+    </w:p>
+    <w:p>
+      <w:pPr>
+        <w:pStyle w:val="Descripcin"/>
+        <w:spacing w:before="240"/>
+        <w:ind w:left="2410" w:right="2408"/>
+      </w:pPr>
+      <w:r>
+        <w:t xml:space="preserve">Anexo </w:t>
+      </w:r>
+      <w:r>
+        <w:fldChar w:fldCharType="begin"/>
+      </w:r>
+      <w:r>
+        <w:instrText xml:space="preserve"> SEQ Anexo \* ARABIC </w:instrText>
+      </w:r>
+      <w:r>
+        <w:fldChar w:fldCharType="separate"/>
+      </w:r>
+      <w:r>
+        <w:rPr>
+          <w:noProof/>
+        </w:rPr>
+        <w:t>7</w:t>
+      </w:r>
+      <w:r>
+        <w:fldChar w:fldCharType="end"/>
+      </w:r>
+      <w:r>
+        <w:tab/>
+      </w:r>
+      <w:r>
+        <w:br/>
+      </w:r>
+      <w:r>
+        <w:rPr>
+          <w:b w:val="0"/>
+          <w:bCs/>
+          <w:i/>
+          <w:iCs w:val="0"/>
+        </w:rPr>
+        <w:t xml:space="preserve">Exploración de </w:t>
+      </w:r>
+      <w:proofErr w:type="spellStart"/>
+      <w:r>
+        <w:rPr>
+          <w:b w:val="0"/>
+          <w:bCs/>
+          <w:i/>
+          <w:iCs w:val="0"/>
+        </w:rPr>
+        <w:t>kernels</w:t>
+      </w:r>
+      <w:proofErr w:type="spellEnd"/>
+      <w:r>
+        <w:rPr>
+          <w:b w:val="0"/>
+          <w:bCs/>
+          <w:i/>
+          <w:iCs w:val="0"/>
+        </w:rPr>
+        <w:t xml:space="preserve"> en la distribución de la población categorizada como formal en el mercado laboral</w:t>
+      </w:r>
+      <w:r>
+        <w:rPr>
+          <w:b w:val="0"/>
+          <w:bCs/>
+          <w:i/>
+          <w:iCs w:val="0"/>
+        </w:rPr>
+        <w:t xml:space="preserve"> según sus ingresos totales</w:t>
+      </w:r>
+    </w:p>
+    <w:p>
+      <w:pPr>
+        <w:pStyle w:val="Sinespaciado"/>
+        <w:jc w:val="center"/>
+      </w:pPr>
+      <w:r>
+        <w:rPr>
+          <w:noProof/>
+        </w:rPr>
+        <w:drawing>
+          <wp:inline distT="0" distB="0" distL="0" distR="0" wp14:anchorId="1692D76B" wp14:editId="69012685">
+            <wp:extent cx="3587502" cy="2403982"/>
+            <wp:effectExtent l="0" t="0" r="0" b="0"/>
+            <wp:docPr id="1195293666" name="Imagen 1"/>
+            <wp:cNvGraphicFramePr>
+              <a:graphicFrameLocks xmlns:a="http://schemas.openxmlformats.org/drawingml/2006/main" noChangeAspect="1"/>
+            </wp:cNvGraphicFramePr>
+            <a:graphic xmlns:a="http://schemas.openxmlformats.org/drawingml/2006/main">
+              <a:graphicData uri="http://schemas.openxmlformats.org/drawingml/2006/picture">
+                <pic:pic xmlns:pic="http://schemas.openxmlformats.org/drawingml/2006/picture">
+                  <pic:nvPicPr>
+                    <pic:cNvPr id="1195293666" name=""/>
+                    <pic:cNvPicPr/>
+                  </pic:nvPicPr>
+                  <pic:blipFill>
+                    <a:blip r:embed="rId25"/>
+                    <a:stretch>
+                      <a:fillRect/>
+                    </a:stretch>
+                  </pic:blipFill>
+                  <pic:spPr>
+                    <a:xfrm>
+                      <a:off x="0" y="0"/>
+                      <a:ext cx="3611966" cy="2420375"/>
+                    </a:xfrm>
+                    <a:prstGeom prst="rect">
+                      <a:avLst/>
+                    </a:prstGeom>
+                  </pic:spPr>
+                </pic:pic>
+              </a:graphicData>
+            </a:graphic>
+          </wp:inline>
+        </w:drawing>
+      </w:r>
+      <w:r>
+        <w:t xml:space="preserve"> </w:t>
+      </w:r>
+    </w:p>
+    <w:p>
+      <w:pPr>
+        <w:pStyle w:val="Descripcin"/>
+        <w:spacing w:before="240"/>
+        <w:ind w:left="2410" w:right="2408"/>
+      </w:pPr>
+      <w:r>
+        <w:t xml:space="preserve">Anexo </w:t>
+      </w:r>
+      <w:r>
+        <w:fldChar w:fldCharType="begin"/>
+      </w:r>
+      <w:r>
+        <w:instrText xml:space="preserve"> SEQ Anexo \* ARABIC </w:instrText>
+      </w:r>
+      <w:r>
+        <w:fldChar w:fldCharType="separate"/>
+      </w:r>
+      <w:r>
+        <w:rPr>
+          <w:noProof/>
+        </w:rPr>
+        <w:t>8</w:t>
+      </w:r>
+      <w:r>
+        <w:fldChar w:fldCharType="end"/>
+      </w:r>
+      <w:r>
+        <w:tab/>
+      </w:r>
+      <w:r>
+        <w:br/>
+      </w:r>
+      <w:r>
+        <w:rPr>
+          <w:b w:val="0"/>
+          <w:bCs/>
+          <w:i/>
+          <w:iCs w:val="0"/>
+        </w:rPr>
+        <w:t xml:space="preserve">Exploración de </w:t>
+      </w:r>
+      <w:proofErr w:type="spellStart"/>
+      <w:r>
+        <w:rPr>
+          <w:b w:val="0"/>
+          <w:bCs/>
+          <w:i/>
+          <w:iCs w:val="0"/>
+        </w:rPr>
+        <w:t>bandwidths</w:t>
+      </w:r>
+      <w:proofErr w:type="spellEnd"/>
+      <w:r>
+        <w:rPr>
+          <w:b w:val="0"/>
+          <w:bCs/>
+          <w:i/>
+          <w:iCs w:val="0"/>
+        </w:rPr>
+        <w:t xml:space="preserve"> en la distribución poblacional formal en el mercado laboral según su</w:t>
+      </w:r>
+      <w:r>
+        <w:rPr>
+          <w:b w:val="0"/>
+          <w:bCs/>
+          <w:i/>
+          <w:iCs w:val="0"/>
+        </w:rPr>
+        <w:t>s ingresos totales</w:t>
+      </w:r>
+    </w:p>
+    <w:p>
+      <w:pPr>
+        <w:pStyle w:val="Sinespaciado"/>
+        <w:jc w:val="center"/>
+      </w:pPr>
+      <w:r>
+        <w:drawing>
+          <wp:inline distT="0" distB="0" distL="0" distR="0" wp14:anchorId="582FBA85" wp14:editId="42FCC94D">
+            <wp:extent cx="3585320" cy="2354580"/>
+            <wp:effectExtent l="0" t="0" r="0" b="0"/>
+            <wp:docPr id="420423469" name="Imagen 1"/>
+            <wp:cNvGraphicFramePr>
+              <a:graphicFrameLocks xmlns:a="http://schemas.openxmlformats.org/drawingml/2006/main" noChangeAspect="1"/>
+            </wp:cNvGraphicFramePr>
+            <a:graphic xmlns:a="http://schemas.openxmlformats.org/drawingml/2006/main">
+              <a:graphicData uri="http://schemas.openxmlformats.org/drawingml/2006/picture">
+                <pic:pic xmlns:pic="http://schemas.openxmlformats.org/drawingml/2006/picture">
+                  <pic:nvPicPr>
+                    <pic:cNvPr id="420423469" name=""/>
+                    <pic:cNvPicPr/>
+                  </pic:nvPicPr>
+                  <pic:blipFill>
+                    <a:blip r:embed="rId26"/>
+                    <a:stretch>
+                      <a:fillRect/>
+                    </a:stretch>
+                  </pic:blipFill>
+                  <pic:spPr>
+                    <a:xfrm>
+                      <a:off x="0" y="0"/>
+                      <a:ext cx="3695352" cy="2426841"/>
+                    </a:xfrm>
+                    <a:prstGeom prst="rect">
+                      <a:avLst/>
+                    </a:prstGeom>
+                  </pic:spPr>
+                </pic:pic>
+              </a:graphicData>
+            </a:graphic>
+          </wp:inline>
+        </w:drawing>
+      </w:r>
+    </w:p>
+    <w:p>
+      <w:pPr>
+        <w:pStyle w:val="Descripcin"/>
+        <w:ind w:left="2410" w:right="2408"/>
+      </w:pPr>
+      <w:r>
+        <w:lastRenderedPageBreak/>
+        <w:t xml:space="preserve">Anexo </w:t>
+      </w:r>
+      <w:r>
+        <w:fldChar w:fldCharType="begin"/>
+      </w:r>
+      <w:r>
+        <w:instrText xml:space="preserve"> SEQ Anexo \* ARABIC </w:instrText>
+      </w:r>
+      <w:r>
+        <w:fldChar w:fldCharType="separate"/>
+      </w:r>
+      <w:r>
+        <w:rPr>
+          <w:noProof/>
+        </w:rPr>
+        <w:t>9</w:t>
+      </w:r>
+      <w:r>
+        <w:fldChar w:fldCharType="end"/>
+      </w:r>
+      <w:r>
+        <w:tab/>
+      </w:r>
+      <w:r>
+        <w:br/>
+      </w:r>
+      <w:r>
+        <w:rPr>
+          <w:b w:val="0"/>
+          <w:bCs/>
+          <w:i/>
+          <w:iCs w:val="0"/>
+        </w:rPr>
+        <w:t xml:space="preserve">Exploración de </w:t>
+      </w:r>
+      <w:proofErr w:type="spellStart"/>
+      <w:r>
+        <w:rPr>
+          <w:b w:val="0"/>
+          <w:bCs/>
+          <w:i/>
+          <w:iCs w:val="0"/>
+        </w:rPr>
+        <w:t>kernels</w:t>
+      </w:r>
+      <w:proofErr w:type="spellEnd"/>
+      <w:r>
+        <w:rPr>
+          <w:b w:val="0"/>
+          <w:bCs/>
+          <w:i/>
+          <w:iCs w:val="0"/>
+        </w:rPr>
+        <w:t xml:space="preserve"> en la distribución de la población categorizada como </w:t>
+      </w:r>
+      <w:r>
+        <w:rPr>
+          <w:b w:val="0"/>
+          <w:bCs/>
+          <w:i/>
+          <w:iCs w:val="0"/>
+        </w:rPr>
+        <w:t>in</w:t>
+      </w:r>
+      <w:r>
+        <w:rPr>
+          <w:b w:val="0"/>
+          <w:bCs/>
+          <w:i/>
+          <w:iCs w:val="0"/>
+        </w:rPr>
+        <w:t>formal en el mercado laboral según sus ingresos totales</w:t>
+      </w:r>
+    </w:p>
+    <w:p>
+      <w:pPr>
+        <w:pStyle w:val="Sinespaciado"/>
+        <w:jc w:val="center"/>
+      </w:pPr>
+      <w:r>
+        <w:drawing>
+          <wp:inline distT="0" distB="0" distL="0" distR="0" wp14:anchorId="36198D4A" wp14:editId="391BE018">
+            <wp:extent cx="3606579" cy="2356587"/>
+            <wp:effectExtent l="0" t="0" r="635" b="5715"/>
+            <wp:docPr id="981092881" name="Imagen 1"/>
+            <wp:cNvGraphicFramePr>
+              <a:graphicFrameLocks xmlns:a="http://schemas.openxmlformats.org/drawingml/2006/main" noChangeAspect="1"/>
+            </wp:cNvGraphicFramePr>
+            <a:graphic xmlns:a="http://schemas.openxmlformats.org/drawingml/2006/main">
+              <a:graphicData uri="http://schemas.openxmlformats.org/drawingml/2006/picture">
+                <pic:pic xmlns:pic="http://schemas.openxmlformats.org/drawingml/2006/picture">
+                  <pic:nvPicPr>
+                    <pic:cNvPr id="981092881" name=""/>
+                    <pic:cNvPicPr/>
+                  </pic:nvPicPr>
+                  <pic:blipFill>
+                    <a:blip r:embed="rId27"/>
+                    <a:stretch>
+                      <a:fillRect/>
+                    </a:stretch>
+                  </pic:blipFill>
+                  <pic:spPr>
+                    <a:xfrm>
+                      <a:off x="0" y="0"/>
+                      <a:ext cx="3656665" cy="2389314"/>
+                    </a:xfrm>
+                    <a:prstGeom prst="rect">
+                      <a:avLst/>
+                    </a:prstGeom>
+                  </pic:spPr>
+                </pic:pic>
+              </a:graphicData>
+            </a:graphic>
+          </wp:inline>
+        </w:drawing>
+      </w:r>
+      <w:r>
+        <w:t xml:space="preserve"> </w:t>
+      </w:r>
+    </w:p>
+    <w:p>
+      <w:pPr>
+        <w:pStyle w:val="Descripcin"/>
+        <w:spacing w:before="240"/>
+        <w:ind w:left="2410" w:right="2408"/>
+      </w:pPr>
+      <w:r>
+        <w:t xml:space="preserve">Anexo </w:t>
+      </w:r>
+      <w:r>
+        <w:fldChar w:fldCharType="begin"/>
+      </w:r>
+      <w:r>
+        <w:instrText xml:space="preserve"> SEQ Anexo \* ARABIC </w:instrText>
+      </w:r>
+      <w:r>
+        <w:fldChar w:fldCharType="separate"/>
+      </w:r>
+      <w:r>
+        <w:t>10</w:t>
+      </w:r>
+      <w:r>
+        <w:fldChar w:fldCharType="end"/>
+      </w:r>
+      <w:r>
+        <w:tab/>
+      </w:r>
+      <w:r>
+        <w:br/>
+      </w:r>
+      <w:r>
+        <w:rPr>
+          <w:b w:val="0"/>
+          <w:bCs/>
+          <w:i/>
+          <w:iCs w:val="0"/>
+        </w:rPr>
+        <w:t xml:space="preserve">Exploración de </w:t>
+      </w:r>
+      <w:proofErr w:type="spellStart"/>
+      <w:r>
+        <w:rPr>
+          <w:b w:val="0"/>
+          <w:bCs/>
+          <w:i/>
+          <w:iCs w:val="0"/>
+        </w:rPr>
+        <w:t>bandwidths</w:t>
+      </w:r>
+      <w:proofErr w:type="spellEnd"/>
+      <w:r>
+        <w:rPr>
+          <w:b w:val="0"/>
+          <w:bCs/>
+          <w:i/>
+          <w:iCs w:val="0"/>
+        </w:rPr>
+        <w:t xml:space="preserve"> en la distribución poblacional </w:t>
+      </w:r>
+      <w:r>
+        <w:rPr>
+          <w:b w:val="0"/>
+          <w:bCs/>
+          <w:i/>
+          <w:iCs w:val="0"/>
+        </w:rPr>
+        <w:t>in</w:t>
+      </w:r>
+      <w:r>
+        <w:rPr>
+          <w:b w:val="0"/>
+          <w:bCs/>
+          <w:i/>
+          <w:iCs w:val="0"/>
+        </w:rPr>
+        <w:t>formal en el mercado laboral según sus ingresos totales</w:t>
+      </w:r>
+    </w:p>
+    <w:p>
+      <w:pPr>
+        <w:pStyle w:val="Sinespaciado"/>
+        <w:spacing w:after="240"/>
+        <w:jc w:val="center"/>
+      </w:pPr>
+      <w:r>
+        <w:drawing>
+          <wp:inline distT="0" distB="0" distL="0" distR="0" wp14:anchorId="49DCF01B" wp14:editId="0BA2C0F9">
+            <wp:extent cx="3590175" cy="2369488"/>
+            <wp:effectExtent l="0" t="0" r="4445" b="5715"/>
+            <wp:docPr id="1876147419" name="Imagen 1"/>
+            <wp:cNvGraphicFramePr>
+              <a:graphicFrameLocks xmlns:a="http://schemas.openxmlformats.org/drawingml/2006/main" noChangeAspect="1"/>
+            </wp:cNvGraphicFramePr>
+            <a:graphic xmlns:a="http://schemas.openxmlformats.org/drawingml/2006/main">
+              <a:graphicData uri="http://schemas.openxmlformats.org/drawingml/2006/picture">
+                <pic:pic xmlns:pic="http://schemas.openxmlformats.org/drawingml/2006/picture">
+                  <pic:nvPicPr>
+                    <pic:cNvPr id="1876147419" name=""/>
+                    <pic:cNvPicPr/>
+                  </pic:nvPicPr>
+                  <pic:blipFill>
+                    <a:blip r:embed="rId28"/>
+                    <a:stretch>
+                      <a:fillRect/>
+                    </a:stretch>
+                  </pic:blipFill>
+                  <pic:spPr>
+                    <a:xfrm>
+                      <a:off x="0" y="0"/>
+                      <a:ext cx="3618821" cy="2388394"/>
+                    </a:xfrm>
+                    <a:prstGeom prst="rect">
+                      <a:avLst/>
+                    </a:prstGeom>
+                  </pic:spPr>
+                </pic:pic>
+              </a:graphicData>
+            </a:graphic>
+          </wp:inline>
+        </w:drawing>
+      </w:r>
+      <w:r>
+        <w:t xml:space="preserve"> </w:t>
+      </w:r>
+    </w:p>
+    <w:p>
+      <w:pPr>
         <w:pStyle w:val="Ttulo2"/>
       </w:pPr>
       <w:r>
-        <w:lastRenderedPageBreak/>
         <w:t>Apéndice</w:t>
       </w:r>
       <w:r>
@@ -7368,6 +8912,7 @@
           <w:szCs w:val="20"/>
           <w:lang w:val="es-US"/>
         </w:rPr>
+        <w:lastRenderedPageBreak/>
         <w:t>Donde consigo el nivel de inflación en Argentina, dame las instrucciones necesarias para encontrar los boletines de inflación mensuales</w:t>
       </w:r>
     </w:p>
@@ -7993,7 +9538,7 @@
       </w:pPr>
     </w:p>
     <w:sectPr>
-      <w:footerReference w:type="default" r:id="rId21"/>
+      <w:footerReference w:type="default" r:id="rId29"/>
       <w:pgSz w:w="11906" w:h="16838"/>
       <w:pgMar w:top="709" w:right="709" w:bottom="851" w:left="709" w:header="709" w:footer="709" w:gutter="0"/>
       <w:pgNumType w:start="1"/>
@@ -14966,19 +16511,24 @@
   <w:rsids>
     <w:rsidRoot w:val="00046A96"/>
     <w:rsid w:val="00046A96"/>
+    <w:rsid w:val="00052680"/>
+    <w:rsid w:val="000745AB"/>
     <w:rsid w:val="00372C2A"/>
     <w:rsid w:val="004C2FA9"/>
     <w:rsid w:val="004C7FDE"/>
+    <w:rsid w:val="004E3732"/>
     <w:rsid w:val="005A5BEE"/>
     <w:rsid w:val="006D29C6"/>
+    <w:rsid w:val="008724E2"/>
     <w:rsid w:val="00A2183C"/>
+    <w:rsid w:val="00A92590"/>
     <w:rsid w:val="00AC13E3"/>
     <w:rsid w:val="00AF2C96"/>
-    <w:rsid w:val="00BE0F6A"/>
     <w:rsid w:val="00DA4981"/>
     <w:rsid w:val="00E36221"/>
     <w:rsid w:val="00E877D6"/>
     <w:rsid w:val="00F07D25"/>
+    <w:rsid w:val="00F47117"/>
   </w:rsids>
   <m:mathPr>
     <m:mathFont m:val="Cambria Math"/>
@@ -15461,10 +17011,6 @@
   </w:style>
   <w:style w:type="paragraph" w:customStyle="1" w:styleId="1FF1D68686A5FC438FF06500EE1D99D5">
     <w:name w:val="1FF1D68686A5FC438FF06500EE1D99D5"/>
-    <w:rsid w:val="00E36221"/>
-  </w:style>
-  <w:style w:type="paragraph" w:customStyle="1" w:styleId="01B83E5E14260C4898E3FC02EE44A5EC">
-    <w:name w:val="01B83E5E14260C4898E3FC02EE44A5EC"/>
     <w:rsid w:val="00E36221"/>
   </w:style>
 </w:styles>

</xml_diff>